<commit_message>
delete interview.docx and edit Description and UML Diagram.docx
</commit_message>
<xml_diff>
--- a/Specifications/Docs/Project Description and UML Diagram.docx
+++ b/Specifications/Docs/Project Description and UML Diagram.docx
@@ -1565,7 +1565,7 @@
           <w:lang w:val="ar-SY" w:bidi="ar-SY"/>
         </w:rPr>
         <w:drawing>
-          <wp:inline distT="0" distB="0" distL="0" distR="0" wp14:anchorId="0D0613EA" wp14:editId="0DC19A27">
+          <wp:inline distT="0" distB="0" distL="0" distR="0" wp14:anchorId="0D0613EA" wp14:editId="1731EF1C">
             <wp:extent cx="6736078" cy="7188200"/>
             <wp:effectExtent l="0" t="0" r="8255" b="0"/>
             <wp:docPr id="1" name="صورة 1"/>
@@ -1946,7 +1946,7 @@
           <w:lang w:val="ar-SY" w:bidi="ar-SY"/>
         </w:rPr>
         <w:drawing>
-          <wp:inline distT="0" distB="0" distL="0" distR="0" wp14:anchorId="0CC82817" wp14:editId="705BD32F">
+          <wp:inline distT="0" distB="0" distL="0" distR="0" wp14:anchorId="0CC82817" wp14:editId="0E2AB36C">
             <wp:extent cx="7732246" cy="6745365"/>
             <wp:effectExtent l="0" t="1905" r="635" b="635"/>
             <wp:docPr id="4" name="صورة 4"/>
@@ -2035,27 +2035,88 @@
         <w:pStyle w:val="a6"/>
         <w:numPr>
           <w:ilvl w:val="0"/>
-          <w:numId w:val="9"/>
+          <w:numId w:val="19"/>
         </w:numPr>
-        <w:tabs>
-          <w:tab w:val="left" w:pos="8640"/>
-        </w:tabs>
-        <w:bidi/>
-        <w:rPr>
-          <w:sz w:val="36"/>
-          <w:szCs w:val="36"/>
-          <w:lang w:bidi="ar-SY"/>
-        </w:rPr>
-      </w:pPr>
-      <w:r>
-        <w:rPr>
-          <w:rFonts w:hint="cs"/>
-          <w:sz w:val="36"/>
-          <w:szCs w:val="36"/>
-          <w:rtl/>
-          <w:lang w:bidi="ar-SY"/>
-        </w:rPr>
-        <w:t xml:space="preserve">انشاء حساب </w:t>
+        <w:bidi/>
+        <w:rPr>
+          <w:rFonts w:hint="cs"/>
+          <w:b/>
+          <w:bCs/>
+          <w:sz w:val="32"/>
+          <w:szCs w:val="32"/>
+          <w:rtl/>
+          <w:lang w:bidi="ar-SY"/>
+        </w:rPr>
+      </w:pPr>
+      <w:r>
+        <w:rPr>
+          <w:rFonts w:hint="cs"/>
+          <w:b/>
+          <w:bCs/>
+          <w:sz w:val="32"/>
+          <w:szCs w:val="32"/>
+          <w:rtl/>
+          <w:lang w:bidi="ar-SY"/>
+        </w:rPr>
+        <w:t>المستخدم الغير مسجل</w:t>
+      </w:r>
+      <w:r>
+        <w:rPr>
+          <w:rFonts w:hint="cs"/>
+          <w:b/>
+          <w:bCs/>
+          <w:sz w:val="32"/>
+          <w:szCs w:val="32"/>
+          <w:rtl/>
+          <w:lang w:bidi="ar-SY"/>
+        </w:rPr>
+        <w:t>(</w:t>
+      </w:r>
+      <w:proofErr w:type="spellStart"/>
+      <w:r>
+        <w:rPr>
+          <w:b/>
+          <w:bCs/>
+          <w:sz w:val="32"/>
+          <w:szCs w:val="32"/>
+          <w:lang w:bidi="ar-SY"/>
+        </w:rPr>
+        <w:t>unrigester</w:t>
+      </w:r>
+      <w:proofErr w:type="spellEnd"/>
+      <w:r>
+        <w:rPr>
+          <w:b/>
+          <w:bCs/>
+          <w:sz w:val="32"/>
+          <w:szCs w:val="32"/>
+          <w:lang w:bidi="ar-SY"/>
+        </w:rPr>
+        <w:t xml:space="preserve"> user</w:t>
+      </w:r>
+      <w:r>
+        <w:rPr>
+          <w:rFonts w:hint="cs"/>
+          <w:b/>
+          <w:bCs/>
+          <w:sz w:val="32"/>
+          <w:szCs w:val="32"/>
+          <w:rtl/>
+          <w:lang w:bidi="ar-SY"/>
+        </w:rPr>
+        <w:t>)</w:t>
+      </w:r>
+      <w:r>
+        <w:rPr>
+          <w:rFonts w:hint="cs"/>
+          <w:b/>
+          <w:bCs/>
+          <w:sz w:val="32"/>
+          <w:szCs w:val="32"/>
+          <w:rtl/>
+          <w:lang w:bidi="ar-SY"/>
+        </w:rPr>
+        <w:t xml:space="preserve"> :</w:t>
       </w:r>
     </w:p>
     <w:p>
@@ -2070,20 +2131,108 @@
         </w:tabs>
         <w:bidi/>
         <w:rPr>
-          <w:sz w:val="36"/>
-          <w:szCs w:val="36"/>
-          <w:lang w:bidi="ar-SY"/>
-        </w:rPr>
-      </w:pPr>
-      <w:r>
-        <w:rPr>
-          <w:rFonts w:hint="cs"/>
-          <w:sz w:val="36"/>
-          <w:szCs w:val="36"/>
-          <w:rtl/>
-          <w:lang w:bidi="ar-SY"/>
-        </w:rPr>
-        <w:t>تسجيل دخول / خروج</w:t>
+          <w:sz w:val="32"/>
+          <w:szCs w:val="32"/>
+          <w:lang w:bidi="ar-SY"/>
+        </w:rPr>
+      </w:pPr>
+      <w:r>
+        <w:rPr>
+          <w:rFonts w:hint="cs"/>
+          <w:sz w:val="32"/>
+          <w:szCs w:val="32"/>
+          <w:rtl/>
+          <w:lang w:bidi="ar-SY"/>
+        </w:rPr>
+        <w:t xml:space="preserve">انشاء حساب </w:t>
+      </w:r>
+    </w:p>
+    <w:p>
+      <w:pPr>
+        <w:pStyle w:val="a6"/>
+        <w:numPr>
+          <w:ilvl w:val="0"/>
+          <w:numId w:val="19"/>
+        </w:numPr>
+        <w:tabs>
+          <w:tab w:val="left" w:pos="8640"/>
+        </w:tabs>
+        <w:bidi/>
+        <w:rPr>
+          <w:b/>
+          <w:bCs/>
+          <w:sz w:val="32"/>
+          <w:szCs w:val="32"/>
+          <w:lang w:bidi="ar-SY"/>
+        </w:rPr>
+      </w:pPr>
+      <w:r>
+        <w:rPr>
+          <w:rFonts w:hint="cs"/>
+          <w:b/>
+          <w:bCs/>
+          <w:sz w:val="32"/>
+          <w:szCs w:val="32"/>
+          <w:rtl/>
+          <w:lang w:bidi="ar-SY"/>
+        </w:rPr>
+        <w:t>المستخدم المسجل</w:t>
+      </w:r>
+      <w:r>
+        <w:rPr>
+          <w:b/>
+          <w:bCs/>
+          <w:sz w:val="32"/>
+          <w:szCs w:val="32"/>
+          <w:lang w:bidi="ar-SY"/>
+        </w:rPr>
+        <w:t xml:space="preserve"> </w:t>
+      </w:r>
+      <w:r>
+        <w:rPr>
+          <w:rFonts w:hint="cs"/>
+          <w:b/>
+          <w:bCs/>
+          <w:sz w:val="32"/>
+          <w:szCs w:val="32"/>
+          <w:rtl/>
+          <w:lang w:bidi="ar-SY"/>
+        </w:rPr>
+        <w:t>(</w:t>
+      </w:r>
+      <w:r>
+        <w:rPr>
+          <w:b/>
+          <w:bCs/>
+          <w:sz w:val="32"/>
+          <w:szCs w:val="32"/>
+          <w:lang w:bidi="ar-SY"/>
+        </w:rPr>
+        <w:t>generate user</w:t>
+      </w:r>
+      <w:r>
+        <w:rPr>
+          <w:rFonts w:hint="cs"/>
+          <w:b/>
+          <w:bCs/>
+          <w:sz w:val="32"/>
+          <w:szCs w:val="32"/>
+          <w:rtl/>
+          <w:lang w:bidi="ar-SY"/>
+        </w:rPr>
+        <w:t>)</w:t>
+      </w:r>
+      <w:r>
+        <w:rPr>
+          <w:rFonts w:hint="cs"/>
+          <w:b/>
+          <w:bCs/>
+          <w:sz w:val="32"/>
+          <w:szCs w:val="32"/>
+          <w:rtl/>
+          <w:lang w:bidi="ar-SY"/>
+        </w:rPr>
+        <w:t xml:space="preserve"> :</w:t>
       </w:r>
     </w:p>
     <w:p>
@@ -2098,16 +2247,44 @@
         </w:tabs>
         <w:bidi/>
         <w:rPr>
-          <w:sz w:val="36"/>
-          <w:szCs w:val="36"/>
-          <w:lang w:bidi="ar-SY"/>
-        </w:rPr>
-      </w:pPr>
-      <w:r>
-        <w:rPr>
-          <w:rFonts w:hint="cs"/>
-          <w:sz w:val="36"/>
-          <w:szCs w:val="36"/>
+          <w:sz w:val="32"/>
+          <w:szCs w:val="32"/>
+          <w:lang w:bidi="ar-SY"/>
+        </w:rPr>
+      </w:pPr>
+      <w:r>
+        <w:rPr>
+          <w:rFonts w:hint="cs"/>
+          <w:sz w:val="32"/>
+          <w:szCs w:val="32"/>
+          <w:rtl/>
+          <w:lang w:bidi="ar-SY"/>
+        </w:rPr>
+        <w:t>تسجيل دخول / خروج</w:t>
+      </w:r>
+    </w:p>
+    <w:p>
+      <w:pPr>
+        <w:pStyle w:val="a6"/>
+        <w:numPr>
+          <w:ilvl w:val="0"/>
+          <w:numId w:val="9"/>
+        </w:numPr>
+        <w:tabs>
+          <w:tab w:val="left" w:pos="8640"/>
+        </w:tabs>
+        <w:bidi/>
+        <w:rPr>
+          <w:sz w:val="32"/>
+          <w:szCs w:val="32"/>
+          <w:lang w:bidi="ar-SY"/>
+        </w:rPr>
+      </w:pPr>
+      <w:r>
+        <w:rPr>
+          <w:rFonts w:hint="cs"/>
+          <w:sz w:val="32"/>
+          <w:szCs w:val="32"/>
           <w:rtl/>
           <w:lang w:bidi="ar-SY"/>
         </w:rPr>
@@ -2175,7 +2352,7 @@
         <w:pStyle w:val="a6"/>
         <w:numPr>
           <w:ilvl w:val="0"/>
-          <w:numId w:val="10"/>
+          <w:numId w:val="9"/>
         </w:numPr>
         <w:tabs>
           <w:tab w:val="left" w:pos="8640"/>
@@ -2195,25 +2372,89 @@
           <w:rtl/>
           <w:lang w:bidi="ar-SY"/>
         </w:rPr>
-        <w:t>إدارة الخوارزميات المحفوظة (</w:t>
-      </w:r>
-      <w:r>
-        <w:rPr>
-          <w:sz w:val="32"/>
-          <w:szCs w:val="32"/>
-          <w:lang w:bidi="ar-SY"/>
-        </w:rPr>
-        <w:t>CRUD</w:t>
-      </w:r>
-      <w:r>
-        <w:rPr>
-          <w:rFonts w:hint="cs"/>
-          <w:sz w:val="32"/>
-          <w:szCs w:val="32"/>
-          <w:rtl/>
-          <w:lang w:bidi="ar-SY"/>
-        </w:rPr>
-        <w:t>)</w:t>
+        <w:t xml:space="preserve">ادخال الخوارزمية </w:t>
+      </w:r>
+    </w:p>
+    <w:p>
+      <w:pPr>
+        <w:pStyle w:val="a6"/>
+        <w:numPr>
+          <w:ilvl w:val="0"/>
+          <w:numId w:val="11"/>
+        </w:numPr>
+        <w:tabs>
+          <w:tab w:val="left" w:pos="8640"/>
+        </w:tabs>
+        <w:bidi/>
+        <w:rPr>
+          <w:sz w:val="32"/>
+          <w:szCs w:val="32"/>
+          <w:lang w:bidi="ar-SY"/>
+        </w:rPr>
+      </w:pPr>
+      <w:r>
+        <w:rPr>
+          <w:rFonts w:hint="cs"/>
+          <w:sz w:val="32"/>
+          <w:szCs w:val="32"/>
+          <w:rtl/>
+          <w:lang w:bidi="ar-SY"/>
+        </w:rPr>
+        <w:t>ادخال مربع نصي</w:t>
+      </w:r>
+    </w:p>
+    <w:p>
+      <w:pPr>
+        <w:pStyle w:val="a6"/>
+        <w:numPr>
+          <w:ilvl w:val="0"/>
+          <w:numId w:val="11"/>
+        </w:numPr>
+        <w:tabs>
+          <w:tab w:val="left" w:pos="8640"/>
+        </w:tabs>
+        <w:bidi/>
+        <w:rPr>
+          <w:sz w:val="32"/>
+          <w:szCs w:val="32"/>
+          <w:lang w:bidi="ar-SY"/>
+        </w:rPr>
+      </w:pPr>
+      <w:r>
+        <w:rPr>
+          <w:rFonts w:hint="cs"/>
+          <w:sz w:val="32"/>
+          <w:szCs w:val="32"/>
+          <w:rtl/>
+          <w:lang w:bidi="ar-SY"/>
+        </w:rPr>
+        <w:t>رفع ملفات</w:t>
+      </w:r>
+    </w:p>
+    <w:p>
+      <w:pPr>
+        <w:pStyle w:val="a6"/>
+        <w:numPr>
+          <w:ilvl w:val="0"/>
+          <w:numId w:val="11"/>
+        </w:numPr>
+        <w:tabs>
+          <w:tab w:val="left" w:pos="8640"/>
+        </w:tabs>
+        <w:bidi/>
+        <w:rPr>
+          <w:sz w:val="32"/>
+          <w:szCs w:val="32"/>
+          <w:lang w:bidi="ar-SY"/>
+        </w:rPr>
+      </w:pPr>
+      <w:r>
+        <w:rPr>
+          <w:sz w:val="32"/>
+          <w:szCs w:val="32"/>
+          <w:lang w:bidi="ar-SY"/>
+        </w:rPr>
+        <w:t>Hold &amp; drop</w:t>
       </w:r>
     </w:p>
     <w:p>
@@ -2241,7 +2482,7 @@
           <w:rtl/>
           <w:lang w:bidi="ar-SY"/>
         </w:rPr>
-        <w:t xml:space="preserve">ادخال الخوارزمية </w:t>
+        <w:t>التحكم بخرج الكود</w:t>
       </w:r>
     </w:p>
     <w:p>
@@ -2249,7 +2490,7 @@
         <w:pStyle w:val="a6"/>
         <w:numPr>
           <w:ilvl w:val="0"/>
-          <w:numId w:val="11"/>
+          <w:numId w:val="12"/>
         </w:numPr>
         <w:tabs>
           <w:tab w:val="left" w:pos="8640"/>
@@ -2269,7 +2510,68 @@
           <w:rtl/>
           <w:lang w:bidi="ar-SY"/>
         </w:rPr>
-        <w:t>ادخال مربع نصي</w:t>
+        <w:t xml:space="preserve">اظهار مخطط تدفقي والتحكم به </w:t>
+      </w:r>
+    </w:p>
+    <w:p>
+      <w:pPr>
+        <w:pStyle w:val="a6"/>
+        <w:tabs>
+          <w:tab w:val="left" w:pos="8640"/>
+        </w:tabs>
+        <w:bidi/>
+        <w:ind w:left="1440"/>
+        <w:rPr>
+          <w:sz w:val="32"/>
+          <w:szCs w:val="32"/>
+          <w:lang w:bidi="ar-SY"/>
+        </w:rPr>
+      </w:pPr>
+      <w:r>
+        <w:rPr>
+          <w:rFonts w:hint="cs"/>
+          <w:sz w:val="32"/>
+          <w:szCs w:val="32"/>
+          <w:rtl/>
+          <w:lang w:bidi="ar-SY"/>
+        </w:rPr>
+        <w:t>(</w:t>
+      </w:r>
+      <w:r>
+        <w:rPr>
+          <w:sz w:val="32"/>
+          <w:szCs w:val="32"/>
+          <w:lang w:bidi="ar-SY"/>
+        </w:rPr>
+        <w:t xml:space="preserve">play | pause | </w:t>
+      </w:r>
+      <w:proofErr w:type="spellStart"/>
+      <w:r>
+        <w:rPr>
+          <w:sz w:val="32"/>
+          <w:szCs w:val="32"/>
+          <w:lang w:bidi="ar-SY"/>
+        </w:rPr>
+        <w:t>prev</w:t>
+      </w:r>
+      <w:proofErr w:type="spellEnd"/>
+      <w:r>
+        <w:rPr>
+          <w:sz w:val="32"/>
+          <w:szCs w:val="32"/>
+          <w:lang w:bidi="ar-SY"/>
+        </w:rPr>
+        <w:t>-step | next-step</w:t>
+      </w:r>
+      <w:r>
+        <w:rPr>
+          <w:rFonts w:hint="cs"/>
+          <w:sz w:val="32"/>
+          <w:szCs w:val="32"/>
+          <w:rtl/>
+          <w:lang w:bidi="ar-SY"/>
+        </w:rPr>
+        <w:t>)</w:t>
       </w:r>
     </w:p>
     <w:p>
@@ -2277,7 +2579,7 @@
         <w:pStyle w:val="a6"/>
         <w:numPr>
           <w:ilvl w:val="0"/>
-          <w:numId w:val="11"/>
+          <w:numId w:val="12"/>
         </w:numPr>
         <w:tabs>
           <w:tab w:val="left" w:pos="8640"/>
@@ -2297,33 +2599,7 @@
           <w:rtl/>
           <w:lang w:bidi="ar-SY"/>
         </w:rPr>
-        <w:t>رفع ملفات</w:t>
-      </w:r>
-    </w:p>
-    <w:p>
-      <w:pPr>
-        <w:pStyle w:val="a6"/>
-        <w:numPr>
-          <w:ilvl w:val="0"/>
-          <w:numId w:val="11"/>
-        </w:numPr>
-        <w:tabs>
-          <w:tab w:val="left" w:pos="8640"/>
-        </w:tabs>
-        <w:bidi/>
-        <w:rPr>
-          <w:sz w:val="32"/>
-          <w:szCs w:val="32"/>
-          <w:lang w:bidi="ar-SY"/>
-        </w:rPr>
-      </w:pPr>
-      <w:r>
-        <w:rPr>
-          <w:sz w:val="32"/>
-          <w:szCs w:val="32"/>
-          <w:lang w:bidi="ar-SY"/>
-        </w:rPr>
-        <w:t>Hold &amp; drop</w:t>
+        <w:t>اظهار بنى المعطيات</w:t>
       </w:r>
     </w:p>
     <w:p>
@@ -2351,7 +2627,7 @@
           <w:rtl/>
           <w:lang w:bidi="ar-SY"/>
         </w:rPr>
-        <w:t>التحكم بخرج الكود</w:t>
+        <w:t xml:space="preserve">البحث عن خوارزميات جاهزة </w:t>
       </w:r>
     </w:p>
     <w:p>
@@ -2379,68 +2655,7 @@
           <w:rtl/>
           <w:lang w:bidi="ar-SY"/>
         </w:rPr>
-        <w:t xml:space="preserve">اظهار مخطط تدفقي والتحكم به </w:t>
-      </w:r>
-    </w:p>
-    <w:p>
-      <w:pPr>
-        <w:pStyle w:val="a6"/>
-        <w:tabs>
-          <w:tab w:val="left" w:pos="8640"/>
-        </w:tabs>
-        <w:bidi/>
-        <w:ind w:left="1440"/>
-        <w:rPr>
-          <w:sz w:val="32"/>
-          <w:szCs w:val="32"/>
-          <w:lang w:bidi="ar-SY"/>
-        </w:rPr>
-      </w:pPr>
-      <w:r>
-        <w:rPr>
-          <w:rFonts w:hint="cs"/>
-          <w:sz w:val="32"/>
-          <w:szCs w:val="32"/>
-          <w:rtl/>
-          <w:lang w:bidi="ar-SY"/>
-        </w:rPr>
-        <w:t>(</w:t>
-      </w:r>
-      <w:r>
-        <w:rPr>
-          <w:sz w:val="32"/>
-          <w:szCs w:val="32"/>
-          <w:lang w:bidi="ar-SY"/>
-        </w:rPr>
-        <w:t xml:space="preserve">play | pause | </w:t>
-      </w:r>
-      <w:proofErr w:type="spellStart"/>
-      <w:r>
-        <w:rPr>
-          <w:sz w:val="32"/>
-          <w:szCs w:val="32"/>
-          <w:lang w:bidi="ar-SY"/>
-        </w:rPr>
-        <w:t>prev</w:t>
-      </w:r>
-      <w:proofErr w:type="spellEnd"/>
-      <w:r>
-        <w:rPr>
-          <w:sz w:val="32"/>
-          <w:szCs w:val="32"/>
-          <w:lang w:bidi="ar-SY"/>
-        </w:rPr>
-        <w:t>-step | next-step</w:t>
-      </w:r>
-      <w:r>
-        <w:rPr>
-          <w:rFonts w:hint="cs"/>
-          <w:sz w:val="32"/>
-          <w:szCs w:val="32"/>
-          <w:rtl/>
-          <w:lang w:bidi="ar-SY"/>
-        </w:rPr>
-        <w:t>)</w:t>
+        <w:t>البحث عن طريق الاسم</w:t>
       </w:r>
     </w:p>
     <w:p>
@@ -2468,7 +2683,15 @@
           <w:rtl/>
           <w:lang w:bidi="ar-SY"/>
         </w:rPr>
-        <w:t>اظهار بنى المعطيات</w:t>
+        <w:t xml:space="preserve">البحث عن طريق ال </w:t>
+      </w:r>
+      <w:r>
+        <w:rPr>
+          <w:sz w:val="32"/>
+          <w:szCs w:val="32"/>
+          <w:lang w:bidi="ar-SY"/>
+        </w:rPr>
+        <w:t>topic</w:t>
       </w:r>
     </w:p>
     <w:p>
@@ -2496,98 +2719,6 @@
           <w:rtl/>
           <w:lang w:bidi="ar-SY"/>
         </w:rPr>
-        <w:t xml:space="preserve">البحث عن خوارزميات جاهزة </w:t>
-      </w:r>
-    </w:p>
-    <w:p>
-      <w:pPr>
-        <w:pStyle w:val="a6"/>
-        <w:numPr>
-          <w:ilvl w:val="0"/>
-          <w:numId w:val="12"/>
-        </w:numPr>
-        <w:tabs>
-          <w:tab w:val="left" w:pos="8640"/>
-        </w:tabs>
-        <w:bidi/>
-        <w:rPr>
-          <w:sz w:val="32"/>
-          <w:szCs w:val="32"/>
-          <w:lang w:bidi="ar-SY"/>
-        </w:rPr>
-      </w:pPr>
-      <w:r>
-        <w:rPr>
-          <w:rFonts w:hint="cs"/>
-          <w:sz w:val="32"/>
-          <w:szCs w:val="32"/>
-          <w:rtl/>
-          <w:lang w:bidi="ar-SY"/>
-        </w:rPr>
-        <w:t>البحث عن طريق الاسم</w:t>
-      </w:r>
-    </w:p>
-    <w:p>
-      <w:pPr>
-        <w:pStyle w:val="a6"/>
-        <w:numPr>
-          <w:ilvl w:val="0"/>
-          <w:numId w:val="12"/>
-        </w:numPr>
-        <w:tabs>
-          <w:tab w:val="left" w:pos="8640"/>
-        </w:tabs>
-        <w:bidi/>
-        <w:rPr>
-          <w:sz w:val="32"/>
-          <w:szCs w:val="32"/>
-          <w:lang w:bidi="ar-SY"/>
-        </w:rPr>
-      </w:pPr>
-      <w:r>
-        <w:rPr>
-          <w:rFonts w:hint="cs"/>
-          <w:sz w:val="32"/>
-          <w:szCs w:val="32"/>
-          <w:rtl/>
-          <w:lang w:bidi="ar-SY"/>
-        </w:rPr>
-        <w:t xml:space="preserve">البحث عن طريق ال </w:t>
-      </w:r>
-      <w:r>
-        <w:rPr>
-          <w:sz w:val="32"/>
-          <w:szCs w:val="32"/>
-          <w:lang w:bidi="ar-SY"/>
-        </w:rPr>
-        <w:t>topic</w:t>
-      </w:r>
-    </w:p>
-    <w:p>
-      <w:pPr>
-        <w:pStyle w:val="a6"/>
-        <w:numPr>
-          <w:ilvl w:val="0"/>
-          <w:numId w:val="9"/>
-        </w:numPr>
-        <w:tabs>
-          <w:tab w:val="left" w:pos="8640"/>
-        </w:tabs>
-        <w:bidi/>
-        <w:rPr>
-          <w:sz w:val="32"/>
-          <w:szCs w:val="32"/>
-          <w:lang w:bidi="ar-SY"/>
-        </w:rPr>
-      </w:pPr>
-      <w:r>
-        <w:rPr>
-          <w:rFonts w:hint="cs"/>
-          <w:sz w:val="32"/>
-          <w:szCs w:val="32"/>
-          <w:rtl/>
-          <w:lang w:bidi="ar-SY"/>
-        </w:rPr>
         <w:t xml:space="preserve">الوصول للخوارزميات الجاهزة </w:t>
       </w:r>
     </w:p>
@@ -2652,27 +2783,77 @@
         <w:pStyle w:val="a6"/>
         <w:numPr>
           <w:ilvl w:val="0"/>
-          <w:numId w:val="9"/>
+          <w:numId w:val="19"/>
         </w:numPr>
         <w:tabs>
           <w:tab w:val="left" w:pos="8640"/>
         </w:tabs>
         <w:bidi/>
         <w:rPr>
-          <w:sz w:val="32"/>
-          <w:szCs w:val="32"/>
-          <w:lang w:bidi="ar-SY"/>
-        </w:rPr>
-      </w:pPr>
-      <w:r>
-        <w:rPr>
-          <w:rFonts w:hint="cs"/>
-          <w:sz w:val="32"/>
-          <w:szCs w:val="32"/>
-          <w:rtl/>
-          <w:lang w:bidi="ar-SY"/>
-        </w:rPr>
-        <w:t>نشر خوارزمية</w:t>
+          <w:b/>
+          <w:bCs/>
+          <w:sz w:val="32"/>
+          <w:szCs w:val="32"/>
+          <w:lang w:bidi="ar-SY"/>
+        </w:rPr>
+      </w:pPr>
+      <w:r>
+        <w:rPr>
+          <w:rFonts w:hint="cs"/>
+          <w:b/>
+          <w:bCs/>
+          <w:sz w:val="32"/>
+          <w:szCs w:val="32"/>
+          <w:rtl/>
+          <w:lang w:bidi="ar-SY"/>
+        </w:rPr>
+        <w:t>المستخدم المساهم</w:t>
+      </w:r>
+      <w:r>
+        <w:rPr>
+          <w:b/>
+          <w:bCs/>
+          <w:sz w:val="32"/>
+          <w:szCs w:val="32"/>
+          <w:lang w:bidi="ar-SY"/>
+        </w:rPr>
+        <w:t xml:space="preserve"> </w:t>
+      </w:r>
+      <w:r>
+        <w:rPr>
+          <w:rFonts w:hint="cs"/>
+          <w:b/>
+          <w:bCs/>
+          <w:sz w:val="32"/>
+          <w:szCs w:val="32"/>
+          <w:rtl/>
+          <w:lang w:bidi="ar-SY"/>
+        </w:rPr>
+        <w:t>(</w:t>
+      </w:r>
+      <w:proofErr w:type="spellStart"/>
+      <w:r>
+        <w:rPr>
+          <w:b/>
+          <w:bCs/>
+          <w:sz w:val="32"/>
+          <w:szCs w:val="32"/>
+          <w:lang w:bidi="ar-SY"/>
+        </w:rPr>
+        <w:t>cotreputer</w:t>
+      </w:r>
+      <w:proofErr w:type="spellEnd"/>
+      <w:r>
+        <w:rPr>
+          <w:rFonts w:hint="cs"/>
+          <w:b/>
+          <w:bCs/>
+          <w:sz w:val="32"/>
+          <w:szCs w:val="32"/>
+          <w:rtl/>
+          <w:lang w:bidi="ar-SY"/>
+        </w:rPr>
+        <w:t>)</w:t>
       </w:r>
     </w:p>
     <w:p>
@@ -2680,7 +2861,7 @@
         <w:pStyle w:val="a6"/>
         <w:numPr>
           <w:ilvl w:val="0"/>
-          <w:numId w:val="9"/>
+          <w:numId w:val="20"/>
         </w:numPr>
         <w:tabs>
           <w:tab w:val="left" w:pos="8640"/>
@@ -2700,11 +2881,16 @@
           <w:rtl/>
           <w:lang w:bidi="ar-SY"/>
         </w:rPr>
-        <w:t>حذف خوارزمية جاهزة</w:t>
-      </w:r>
-    </w:p>
-    <w:p>
-      <w:pPr>
+        <w:t xml:space="preserve">إدارة الملف الشخصي </w:t>
+      </w:r>
+    </w:p>
+    <w:p>
+      <w:pPr>
+        <w:pStyle w:val="a6"/>
+        <w:numPr>
+          <w:ilvl w:val="0"/>
+          <w:numId w:val="10"/>
+        </w:numPr>
         <w:tabs>
           <w:tab w:val="left" w:pos="8640"/>
         </w:tabs>
@@ -2715,29 +2901,724 @@
           <w:lang w:bidi="ar-SY"/>
         </w:rPr>
       </w:pPr>
-    </w:p>
-    <w:p>
-      <w:pPr>
+      <w:r>
+        <w:rPr>
+          <w:rFonts w:hint="cs"/>
+          <w:sz w:val="32"/>
+          <w:szCs w:val="32"/>
+          <w:rtl/>
+          <w:lang w:bidi="ar-SY"/>
+        </w:rPr>
+        <w:t>إدارة الخوارزميات المحفوظة (</w:t>
+      </w:r>
+      <w:r>
+        <w:rPr>
+          <w:sz w:val="32"/>
+          <w:szCs w:val="32"/>
+          <w:lang w:bidi="ar-SY"/>
+        </w:rPr>
+        <w:t>CRUD</w:t>
+      </w:r>
+      <w:r>
+        <w:rPr>
+          <w:rFonts w:hint="cs"/>
+          <w:sz w:val="32"/>
+          <w:szCs w:val="32"/>
+          <w:rtl/>
+          <w:lang w:bidi="ar-SY"/>
+        </w:rPr>
+        <w:t>)</w:t>
+      </w:r>
+    </w:p>
+    <w:p>
+      <w:pPr>
+        <w:pStyle w:val="a6"/>
+        <w:numPr>
+          <w:ilvl w:val="0"/>
+          <w:numId w:val="20"/>
+        </w:numPr>
         <w:tabs>
           <w:tab w:val="left" w:pos="8640"/>
         </w:tabs>
         <w:bidi/>
-        <w:ind w:left="360"/>
-        <w:rPr>
-          <w:sz w:val="32"/>
-          <w:szCs w:val="32"/>
-          <w:lang w:bidi="ar-SY"/>
-        </w:rPr>
-      </w:pPr>
-    </w:p>
-    <w:p>
-      <w:pPr>
+        <w:rPr>
+          <w:sz w:val="32"/>
+          <w:szCs w:val="32"/>
+          <w:lang w:bidi="ar-SY"/>
+        </w:rPr>
+      </w:pPr>
+      <w:r>
+        <w:rPr>
+          <w:rFonts w:hint="cs"/>
+          <w:sz w:val="32"/>
+          <w:szCs w:val="32"/>
+          <w:rtl/>
+          <w:lang w:bidi="ar-SY"/>
+        </w:rPr>
+        <w:t>نشر خوارزمية</w:t>
+      </w:r>
+    </w:p>
+    <w:p>
+      <w:pPr>
+        <w:pStyle w:val="a6"/>
+        <w:numPr>
+          <w:ilvl w:val="0"/>
+          <w:numId w:val="20"/>
+        </w:numPr>
         <w:tabs>
           <w:tab w:val="left" w:pos="8640"/>
         </w:tabs>
         <w:bidi/>
         <w:rPr>
-          <w:rFonts w:hint="cs"/>
+          <w:sz w:val="32"/>
+          <w:szCs w:val="32"/>
+          <w:lang w:bidi="ar-SY"/>
+        </w:rPr>
+      </w:pPr>
+      <w:r>
+        <w:rPr>
+          <w:rFonts w:hint="cs"/>
+          <w:sz w:val="32"/>
+          <w:szCs w:val="32"/>
+          <w:rtl/>
+          <w:lang w:bidi="ar-SY"/>
+        </w:rPr>
+        <w:t>حذف خوارزمية جاهزة</w:t>
+      </w:r>
+    </w:p>
+    <w:p>
+      <w:pPr>
+        <w:pStyle w:val="a6"/>
+        <w:numPr>
+          <w:ilvl w:val="0"/>
+          <w:numId w:val="19"/>
+        </w:numPr>
+        <w:tabs>
+          <w:tab w:val="left" w:pos="8640"/>
+        </w:tabs>
+        <w:bidi/>
+        <w:rPr>
+          <w:b/>
+          <w:bCs/>
+          <w:sz w:val="32"/>
+          <w:szCs w:val="32"/>
+          <w:lang w:bidi="ar-SY"/>
+        </w:rPr>
+      </w:pPr>
+      <w:r>
+        <w:rPr>
+          <w:b/>
+          <w:bCs/>
+          <w:sz w:val="32"/>
+          <w:szCs w:val="32"/>
+          <w:lang w:bidi="ar-SY"/>
+        </w:rPr>
+        <w:t>A</w:t>
+      </w:r>
+      <w:r>
+        <w:rPr>
+          <w:b/>
+          <w:bCs/>
+          <w:sz w:val="32"/>
+          <w:szCs w:val="32"/>
+          <w:lang w:bidi="ar-SY"/>
+        </w:rPr>
+        <w:t>dmin</w:t>
+      </w:r>
+    </w:p>
+    <w:p>
+      <w:pPr>
+        <w:pStyle w:val="a6"/>
+        <w:numPr>
+          <w:ilvl w:val="0"/>
+          <w:numId w:val="21"/>
+        </w:numPr>
+        <w:tabs>
+          <w:tab w:val="left" w:pos="8640"/>
+        </w:tabs>
+        <w:bidi/>
+        <w:rPr>
+          <w:sz w:val="32"/>
+          <w:szCs w:val="32"/>
+          <w:lang w:bidi="ar-SY"/>
+        </w:rPr>
+      </w:pPr>
+      <w:r>
+        <w:rPr>
+          <w:rFonts w:hint="cs"/>
+          <w:sz w:val="32"/>
+          <w:szCs w:val="32"/>
+          <w:rtl/>
+          <w:lang w:bidi="ar-SY"/>
+        </w:rPr>
+        <w:t xml:space="preserve">إدارة ال </w:t>
+      </w:r>
+      <w:r>
+        <w:rPr>
+          <w:sz w:val="32"/>
+          <w:szCs w:val="32"/>
+          <w:lang w:bidi="ar-SY"/>
+        </w:rPr>
+        <w:t>topics</w:t>
+      </w:r>
+    </w:p>
+    <w:p>
+      <w:pPr>
+        <w:pStyle w:val="a6"/>
+        <w:numPr>
+          <w:ilvl w:val="0"/>
+          <w:numId w:val="10"/>
+        </w:numPr>
+        <w:tabs>
+          <w:tab w:val="left" w:pos="8640"/>
+        </w:tabs>
+        <w:bidi/>
+        <w:rPr>
+          <w:sz w:val="32"/>
+          <w:szCs w:val="32"/>
+          <w:lang w:bidi="ar-SY"/>
+        </w:rPr>
+      </w:pPr>
+      <w:r>
+        <w:rPr>
+          <w:rFonts w:hint="cs"/>
+          <w:sz w:val="32"/>
+          <w:szCs w:val="32"/>
+          <w:rtl/>
+          <w:lang w:bidi="ar-SY"/>
+        </w:rPr>
+        <w:t>إضافة</w:t>
+      </w:r>
+    </w:p>
+    <w:p>
+      <w:pPr>
+        <w:pStyle w:val="a6"/>
+        <w:numPr>
+          <w:ilvl w:val="0"/>
+          <w:numId w:val="10"/>
+        </w:numPr>
+        <w:tabs>
+          <w:tab w:val="left" w:pos="8640"/>
+        </w:tabs>
+        <w:bidi/>
+        <w:rPr>
+          <w:sz w:val="32"/>
+          <w:szCs w:val="32"/>
+          <w:lang w:bidi="ar-SY"/>
+        </w:rPr>
+      </w:pPr>
+      <w:r>
+        <w:rPr>
+          <w:rFonts w:hint="cs"/>
+          <w:sz w:val="32"/>
+          <w:szCs w:val="32"/>
+          <w:rtl/>
+          <w:lang w:bidi="ar-SY"/>
+        </w:rPr>
+        <w:t>تعديل</w:t>
+      </w:r>
+    </w:p>
+    <w:p>
+      <w:pPr>
+        <w:pStyle w:val="a6"/>
+        <w:numPr>
+          <w:ilvl w:val="0"/>
+          <w:numId w:val="10"/>
+        </w:numPr>
+        <w:tabs>
+          <w:tab w:val="left" w:pos="8640"/>
+        </w:tabs>
+        <w:bidi/>
+        <w:rPr>
+          <w:sz w:val="32"/>
+          <w:szCs w:val="32"/>
+          <w:lang w:bidi="ar-SY"/>
+        </w:rPr>
+      </w:pPr>
+      <w:r>
+        <w:rPr>
+          <w:rFonts w:hint="cs"/>
+          <w:sz w:val="32"/>
+          <w:szCs w:val="32"/>
+          <w:rtl/>
+          <w:lang w:bidi="ar-SY"/>
+        </w:rPr>
+        <w:t>حذف</w:t>
+      </w:r>
+    </w:p>
+    <w:p>
+      <w:pPr>
+        <w:pStyle w:val="a6"/>
+        <w:numPr>
+          <w:ilvl w:val="0"/>
+          <w:numId w:val="21"/>
+        </w:numPr>
+        <w:tabs>
+          <w:tab w:val="left" w:pos="8640"/>
+        </w:tabs>
+        <w:bidi/>
+        <w:rPr>
+          <w:sz w:val="32"/>
+          <w:szCs w:val="32"/>
+          <w:lang w:bidi="ar-SY"/>
+        </w:rPr>
+      </w:pPr>
+      <w:r>
+        <w:rPr>
+          <w:rFonts w:hint="cs"/>
+          <w:sz w:val="32"/>
+          <w:szCs w:val="32"/>
+          <w:rtl/>
+          <w:lang w:bidi="ar-SY"/>
+        </w:rPr>
+        <w:lastRenderedPageBreak/>
+        <w:t xml:space="preserve">تبديل الأدوار </w:t>
+      </w:r>
+    </w:p>
+    <w:p>
+      <w:pPr>
+        <w:pStyle w:val="a6"/>
+        <w:numPr>
+          <w:ilvl w:val="0"/>
+          <w:numId w:val="24"/>
+        </w:numPr>
+        <w:tabs>
+          <w:tab w:val="left" w:pos="8640"/>
+        </w:tabs>
+        <w:bidi/>
+        <w:rPr>
+          <w:sz w:val="32"/>
+          <w:szCs w:val="32"/>
+          <w:lang w:bidi="ar-SY"/>
+        </w:rPr>
+      </w:pPr>
+      <w:r>
+        <w:rPr>
+          <w:rFonts w:hint="cs"/>
+          <w:sz w:val="32"/>
+          <w:szCs w:val="32"/>
+          <w:rtl/>
+          <w:lang w:bidi="ar-SY"/>
+        </w:rPr>
+        <w:t>التبديل لمستخدم مساهم</w:t>
+      </w:r>
+    </w:p>
+    <w:p>
+      <w:pPr>
+        <w:pStyle w:val="a6"/>
+        <w:numPr>
+          <w:ilvl w:val="0"/>
+          <w:numId w:val="24"/>
+        </w:numPr>
+        <w:tabs>
+          <w:tab w:val="left" w:pos="8640"/>
+        </w:tabs>
+        <w:bidi/>
+        <w:rPr>
+          <w:sz w:val="32"/>
+          <w:szCs w:val="32"/>
+          <w:lang w:bidi="ar-SY"/>
+        </w:rPr>
+      </w:pPr>
+      <w:r>
+        <w:rPr>
+          <w:rFonts w:hint="cs"/>
+          <w:sz w:val="32"/>
+          <w:szCs w:val="32"/>
+          <w:rtl/>
+          <w:lang w:bidi="ar-SY"/>
+        </w:rPr>
+        <w:t xml:space="preserve">العودة الى </w:t>
+      </w:r>
+      <w:r>
+        <w:rPr>
+          <w:sz w:val="32"/>
+          <w:szCs w:val="32"/>
+          <w:lang w:bidi="ar-SY"/>
+        </w:rPr>
+        <w:t>admin</w:t>
+      </w:r>
+    </w:p>
+    <w:p>
+      <w:pPr>
+        <w:pStyle w:val="a6"/>
+        <w:numPr>
+          <w:ilvl w:val="0"/>
+          <w:numId w:val="21"/>
+        </w:numPr>
+        <w:tabs>
+          <w:tab w:val="left" w:pos="8640"/>
+        </w:tabs>
+        <w:bidi/>
+        <w:rPr>
+          <w:sz w:val="32"/>
+          <w:szCs w:val="32"/>
+          <w:lang w:bidi="ar-SY"/>
+        </w:rPr>
+      </w:pPr>
+      <w:r>
+        <w:rPr>
+          <w:rFonts w:hint="cs"/>
+          <w:sz w:val="32"/>
+          <w:szCs w:val="32"/>
+          <w:rtl/>
+          <w:lang w:bidi="ar-SY"/>
+        </w:rPr>
+        <w:t xml:space="preserve">إدارة المستخدمين </w:t>
+      </w:r>
+    </w:p>
+    <w:p>
+      <w:pPr>
+        <w:pStyle w:val="a6"/>
+        <w:numPr>
+          <w:ilvl w:val="0"/>
+          <w:numId w:val="25"/>
+        </w:numPr>
+        <w:tabs>
+          <w:tab w:val="left" w:pos="8640"/>
+        </w:tabs>
+        <w:bidi/>
+        <w:rPr>
+          <w:sz w:val="32"/>
+          <w:szCs w:val="32"/>
+          <w:lang w:bidi="ar-SY"/>
+        </w:rPr>
+      </w:pPr>
+      <w:r>
+        <w:rPr>
+          <w:rFonts w:hint="cs"/>
+          <w:sz w:val="32"/>
+          <w:szCs w:val="32"/>
+          <w:rtl/>
+          <w:lang w:bidi="ar-SY"/>
+        </w:rPr>
+        <w:t>حذف مستخدم</w:t>
+      </w:r>
+    </w:p>
+    <w:p>
+      <w:pPr>
+        <w:pStyle w:val="a6"/>
+        <w:numPr>
+          <w:ilvl w:val="0"/>
+          <w:numId w:val="25"/>
+        </w:numPr>
+        <w:tabs>
+          <w:tab w:val="left" w:pos="8640"/>
+        </w:tabs>
+        <w:bidi/>
+        <w:rPr>
+          <w:sz w:val="32"/>
+          <w:szCs w:val="32"/>
+          <w:lang w:bidi="ar-SY"/>
+        </w:rPr>
+      </w:pPr>
+      <w:r>
+        <w:rPr>
+          <w:rFonts w:hint="cs"/>
+          <w:sz w:val="32"/>
+          <w:szCs w:val="32"/>
+          <w:rtl/>
+          <w:lang w:bidi="ar-SY"/>
+        </w:rPr>
+        <w:t>ترقية مستخدم</w:t>
+      </w:r>
+    </w:p>
+    <w:p>
+      <w:pPr>
+        <w:pStyle w:val="a6"/>
+        <w:numPr>
+          <w:ilvl w:val="0"/>
+          <w:numId w:val="25"/>
+        </w:numPr>
+        <w:tabs>
+          <w:tab w:val="left" w:pos="8640"/>
+        </w:tabs>
+        <w:bidi/>
+        <w:rPr>
+          <w:sz w:val="32"/>
+          <w:szCs w:val="32"/>
+          <w:lang w:bidi="ar-SY"/>
+        </w:rPr>
+      </w:pPr>
+      <w:r>
+        <w:rPr>
+          <w:rFonts w:hint="cs"/>
+          <w:sz w:val="32"/>
+          <w:szCs w:val="32"/>
+          <w:rtl/>
+          <w:lang w:bidi="ar-SY"/>
+        </w:rPr>
+        <w:t>حذف مساهم</w:t>
+      </w:r>
+    </w:p>
+    <w:p>
+      <w:pPr>
+        <w:pStyle w:val="a6"/>
+        <w:numPr>
+          <w:ilvl w:val="0"/>
+          <w:numId w:val="25"/>
+        </w:numPr>
+        <w:tabs>
+          <w:tab w:val="left" w:pos="8640"/>
+        </w:tabs>
+        <w:bidi/>
+        <w:rPr>
+          <w:sz w:val="32"/>
+          <w:szCs w:val="32"/>
+          <w:lang w:bidi="ar-SY"/>
+        </w:rPr>
+      </w:pPr>
+      <w:r>
+        <w:rPr>
+          <w:rFonts w:hint="cs"/>
+          <w:sz w:val="32"/>
+          <w:szCs w:val="32"/>
+          <w:rtl/>
+          <w:lang w:bidi="ar-SY"/>
+        </w:rPr>
+        <w:t>تخفيض المساهم الى مستخدم عادي أو العكس</w:t>
+      </w:r>
+    </w:p>
+    <w:p>
+      <w:pPr>
+        <w:pStyle w:val="a6"/>
+        <w:numPr>
+          <w:ilvl w:val="0"/>
+          <w:numId w:val="19"/>
+        </w:numPr>
+        <w:tabs>
+          <w:tab w:val="left" w:pos="8640"/>
+        </w:tabs>
+        <w:bidi/>
+        <w:rPr>
+          <w:b/>
+          <w:bCs/>
+          <w:sz w:val="32"/>
+          <w:szCs w:val="32"/>
+          <w:lang w:bidi="ar-SY"/>
+        </w:rPr>
+      </w:pPr>
+      <w:r>
+        <w:rPr>
+          <w:b/>
+          <w:bCs/>
+          <w:sz w:val="32"/>
+          <w:szCs w:val="32"/>
+          <w:lang w:bidi="ar-SY"/>
+        </w:rPr>
+        <w:t>Su</w:t>
+      </w:r>
+      <w:r>
+        <w:rPr>
+          <w:b/>
+          <w:bCs/>
+          <w:sz w:val="32"/>
+          <w:szCs w:val="32"/>
+          <w:lang w:bidi="ar-SY"/>
+        </w:rPr>
+        <w:t>p</w:t>
+      </w:r>
+      <w:r>
+        <w:rPr>
+          <w:b/>
+          <w:bCs/>
+          <w:sz w:val="32"/>
+          <w:szCs w:val="32"/>
+          <w:lang w:bidi="ar-SY"/>
+        </w:rPr>
+        <w:t>er Admin</w:t>
+      </w:r>
+    </w:p>
+    <w:p>
+      <w:pPr>
+        <w:pStyle w:val="a6"/>
+        <w:numPr>
+          <w:ilvl w:val="0"/>
+          <w:numId w:val="23"/>
+        </w:numPr>
+        <w:tabs>
+          <w:tab w:val="left" w:pos="8640"/>
+        </w:tabs>
+        <w:bidi/>
+        <w:rPr>
+          <w:sz w:val="32"/>
+          <w:szCs w:val="32"/>
+          <w:lang w:bidi="ar-SY"/>
+        </w:rPr>
+      </w:pPr>
+      <w:r>
+        <w:rPr>
+          <w:rFonts w:hint="cs"/>
+          <w:sz w:val="32"/>
+          <w:szCs w:val="32"/>
+          <w:rtl/>
+          <w:lang w:bidi="ar-SY"/>
+        </w:rPr>
+        <w:t xml:space="preserve">إدارة ال </w:t>
+      </w:r>
+      <w:r>
+        <w:rPr>
+          <w:sz w:val="32"/>
+          <w:szCs w:val="32"/>
+          <w:lang w:bidi="ar-SY"/>
+        </w:rPr>
+        <w:t>admin</w:t>
+      </w:r>
+      <w:r>
+        <w:rPr>
+          <w:rFonts w:hint="cs"/>
+          <w:sz w:val="32"/>
+          <w:szCs w:val="32"/>
+          <w:rtl/>
+          <w:lang w:bidi="ar-SY"/>
+        </w:rPr>
+        <w:t xml:space="preserve"> </w:t>
+      </w:r>
+    </w:p>
+    <w:p>
+      <w:pPr>
+        <w:pStyle w:val="a6"/>
+        <w:numPr>
+          <w:ilvl w:val="0"/>
+          <w:numId w:val="26"/>
+        </w:numPr>
+        <w:tabs>
+          <w:tab w:val="left" w:pos="8640"/>
+        </w:tabs>
+        <w:bidi/>
+        <w:rPr>
+          <w:sz w:val="32"/>
+          <w:szCs w:val="32"/>
+          <w:lang w:bidi="ar-SY"/>
+        </w:rPr>
+      </w:pPr>
+      <w:r>
+        <w:rPr>
+          <w:rFonts w:hint="cs"/>
+          <w:sz w:val="32"/>
+          <w:szCs w:val="32"/>
+          <w:rtl/>
+          <w:lang w:bidi="ar-SY"/>
+        </w:rPr>
+        <w:t xml:space="preserve">حذف </w:t>
+      </w:r>
+      <w:r>
+        <w:rPr>
+          <w:sz w:val="32"/>
+          <w:szCs w:val="32"/>
+          <w:lang w:bidi="ar-SY"/>
+        </w:rPr>
+        <w:t xml:space="preserve"> admin</w:t>
+      </w:r>
+    </w:p>
+    <w:p>
+      <w:pPr>
+        <w:pStyle w:val="a6"/>
+        <w:numPr>
+          <w:ilvl w:val="0"/>
+          <w:numId w:val="26"/>
+        </w:numPr>
+        <w:tabs>
+          <w:tab w:val="left" w:pos="8640"/>
+        </w:tabs>
+        <w:bidi/>
+        <w:rPr>
+          <w:sz w:val="32"/>
+          <w:szCs w:val="32"/>
+          <w:lang w:bidi="ar-SY"/>
+        </w:rPr>
+      </w:pPr>
+      <w:r>
+        <w:rPr>
+          <w:rFonts w:hint="cs"/>
+          <w:sz w:val="32"/>
+          <w:szCs w:val="32"/>
+          <w:rtl/>
+          <w:lang w:bidi="ar-SY"/>
+        </w:rPr>
+        <w:t xml:space="preserve">ترقية </w:t>
+      </w:r>
+      <w:r>
+        <w:rPr>
+          <w:sz w:val="32"/>
+          <w:szCs w:val="32"/>
+          <w:lang w:bidi="ar-SY"/>
+        </w:rPr>
+        <w:t>admin</w:t>
+      </w:r>
+    </w:p>
+    <w:p>
+      <w:pPr>
+        <w:pStyle w:val="a6"/>
+        <w:numPr>
+          <w:ilvl w:val="0"/>
+          <w:numId w:val="26"/>
+        </w:numPr>
+        <w:tabs>
+          <w:tab w:val="left" w:pos="8640"/>
+        </w:tabs>
+        <w:bidi/>
+        <w:rPr>
+          <w:sz w:val="32"/>
+          <w:szCs w:val="32"/>
+          <w:lang w:bidi="ar-SY"/>
+        </w:rPr>
+      </w:pPr>
+      <w:r>
+        <w:rPr>
+          <w:rFonts w:hint="cs"/>
+          <w:sz w:val="32"/>
+          <w:szCs w:val="32"/>
+          <w:rtl/>
+          <w:lang w:bidi="ar-SY"/>
+        </w:rPr>
+        <w:t xml:space="preserve">ترقية </w:t>
+      </w:r>
+      <w:proofErr w:type="spellStart"/>
+      <w:r>
+        <w:rPr>
+          <w:sz w:val="32"/>
+          <w:szCs w:val="32"/>
+          <w:lang w:bidi="ar-SY"/>
+        </w:rPr>
+        <w:t>cotreputer</w:t>
+      </w:r>
+      <w:proofErr w:type="spellEnd"/>
+    </w:p>
+    <w:p>
+      <w:pPr>
+        <w:tabs>
+          <w:tab w:val="left" w:pos="8640"/>
+        </w:tabs>
+        <w:bidi/>
+        <w:rPr>
+          <w:sz w:val="32"/>
+          <w:szCs w:val="32"/>
+          <w:lang w:bidi="ar-SY"/>
+        </w:rPr>
+      </w:pPr>
+    </w:p>
+    <w:p>
+      <w:pPr>
+        <w:tabs>
+          <w:tab w:val="left" w:pos="8640"/>
+        </w:tabs>
+        <w:bidi/>
+        <w:ind w:left="360"/>
+        <w:rPr>
+          <w:sz w:val="32"/>
+          <w:szCs w:val="32"/>
+          <w:lang w:bidi="ar-SY"/>
+        </w:rPr>
+      </w:pPr>
+    </w:p>
+    <w:p>
+      <w:pPr>
+        <w:tabs>
+          <w:tab w:val="left" w:pos="8640"/>
+        </w:tabs>
+        <w:bidi/>
+        <w:rPr>
           <w:sz w:val="32"/>
           <w:szCs w:val="32"/>
           <w:lang w:bidi="ar-SY"/>
@@ -2939,6 +3820,95 @@
     </w:lvl>
   </w:abstractNum>
   <w:abstractNum w:abstractNumId="1" w15:restartNumberingAfterBreak="0">
+    <w:nsid w:val="0F3766B8"/>
+    <w:multiLevelType w:val="hybridMultilevel"/>
+    <w:tmpl w:val="39B8C1A4"/>
+    <w:lvl w:ilvl="0" w:tplc="5A889720">
+      <w:start w:val="1"/>
+      <w:numFmt w:val="decimal"/>
+      <w:lvlText w:val="%1-"/>
+      <w:lvlJc w:val="left"/>
+      <w:pPr>
+        <w:ind w:left="720" w:hanging="360"/>
+      </w:pPr>
+      <w:rPr>
+        <w:rFonts w:hint="default"/>
+      </w:rPr>
+    </w:lvl>
+    <w:lvl w:ilvl="1" w:tplc="04090019" w:tentative="1">
+      <w:start w:val="1"/>
+      <w:numFmt w:val="lowerLetter"/>
+      <w:lvlText w:val="%2."/>
+      <w:lvlJc w:val="left"/>
+      <w:pPr>
+        <w:ind w:left="1440" w:hanging="360"/>
+      </w:pPr>
+    </w:lvl>
+    <w:lvl w:ilvl="2" w:tplc="0409001B" w:tentative="1">
+      <w:start w:val="1"/>
+      <w:numFmt w:val="lowerRoman"/>
+      <w:lvlText w:val="%3."/>
+      <w:lvlJc w:val="right"/>
+      <w:pPr>
+        <w:ind w:left="2160" w:hanging="180"/>
+      </w:pPr>
+    </w:lvl>
+    <w:lvl w:ilvl="3" w:tplc="0409000F" w:tentative="1">
+      <w:start w:val="1"/>
+      <w:numFmt w:val="decimal"/>
+      <w:lvlText w:val="%4."/>
+      <w:lvlJc w:val="left"/>
+      <w:pPr>
+        <w:ind w:left="2880" w:hanging="360"/>
+      </w:pPr>
+    </w:lvl>
+    <w:lvl w:ilvl="4" w:tplc="04090019" w:tentative="1">
+      <w:start w:val="1"/>
+      <w:numFmt w:val="lowerLetter"/>
+      <w:lvlText w:val="%5."/>
+      <w:lvlJc w:val="left"/>
+      <w:pPr>
+        <w:ind w:left="3600" w:hanging="360"/>
+      </w:pPr>
+    </w:lvl>
+    <w:lvl w:ilvl="5" w:tplc="0409001B" w:tentative="1">
+      <w:start w:val="1"/>
+      <w:numFmt w:val="lowerRoman"/>
+      <w:lvlText w:val="%6."/>
+      <w:lvlJc w:val="right"/>
+      <w:pPr>
+        <w:ind w:left="4320" w:hanging="180"/>
+      </w:pPr>
+    </w:lvl>
+    <w:lvl w:ilvl="6" w:tplc="0409000F" w:tentative="1">
+      <w:start w:val="1"/>
+      <w:numFmt w:val="decimal"/>
+      <w:lvlText w:val="%7."/>
+      <w:lvlJc w:val="left"/>
+      <w:pPr>
+        <w:ind w:left="5040" w:hanging="360"/>
+      </w:pPr>
+    </w:lvl>
+    <w:lvl w:ilvl="7" w:tplc="04090019" w:tentative="1">
+      <w:start w:val="1"/>
+      <w:numFmt w:val="lowerLetter"/>
+      <w:lvlText w:val="%8."/>
+      <w:lvlJc w:val="left"/>
+      <w:pPr>
+        <w:ind w:left="5760" w:hanging="360"/>
+      </w:pPr>
+    </w:lvl>
+    <w:lvl w:ilvl="8" w:tplc="0409001B" w:tentative="1">
+      <w:start w:val="1"/>
+      <w:numFmt w:val="lowerRoman"/>
+      <w:lvlText w:val="%9."/>
+      <w:lvlJc w:val="right"/>
+      <w:pPr>
+        <w:ind w:left="6480" w:hanging="180"/>
+      </w:pPr>
+    </w:lvl>
+  </w:abstractNum>
+  <w:abstractNum w:abstractNumId="2" w15:restartNumberingAfterBreak="0">
     <w:nsid w:val="11E24544"/>
     <w:multiLevelType w:val="hybridMultilevel"/>
     <w:tmpl w:val="499E8308"/>
@@ -3027,7 +3997,7 @@
       </w:pPr>
     </w:lvl>
   </w:abstractNum>
-  <w:abstractNum w:abstractNumId="2" w15:restartNumberingAfterBreak="0">
+  <w:abstractNum w:abstractNumId="3" w15:restartNumberingAfterBreak="0">
     <w:nsid w:val="186056D2"/>
     <w:multiLevelType w:val="hybridMultilevel"/>
     <w:tmpl w:val="29FE3BA6"/>
@@ -3116,7 +4086,7 @@
       </w:pPr>
     </w:lvl>
   </w:abstractNum>
-  <w:abstractNum w:abstractNumId="3" w15:restartNumberingAfterBreak="0">
+  <w:abstractNum w:abstractNumId="4" w15:restartNumberingAfterBreak="0">
     <w:nsid w:val="18CF05E6"/>
     <w:multiLevelType w:val="hybridMultilevel"/>
     <w:tmpl w:val="13C86516"/>
@@ -3229,7 +4199,7 @@
       </w:rPr>
     </w:lvl>
   </w:abstractNum>
-  <w:abstractNum w:abstractNumId="4" w15:restartNumberingAfterBreak="0">
+  <w:abstractNum w:abstractNumId="5" w15:restartNumberingAfterBreak="0">
     <w:nsid w:val="1A8D5175"/>
     <w:multiLevelType w:val="hybridMultilevel"/>
     <w:tmpl w:val="5B0C6946"/>
@@ -3318,7 +4288,7 @@
       </w:pPr>
     </w:lvl>
   </w:abstractNum>
-  <w:abstractNum w:abstractNumId="5" w15:restartNumberingAfterBreak="0">
+  <w:abstractNum w:abstractNumId="6" w15:restartNumberingAfterBreak="0">
     <w:nsid w:val="1AE86874"/>
     <w:multiLevelType w:val="hybridMultilevel"/>
     <w:tmpl w:val="70ACD736"/>
@@ -3431,7 +4401,7 @@
       </w:rPr>
     </w:lvl>
   </w:abstractNum>
-  <w:abstractNum w:abstractNumId="6" w15:restartNumberingAfterBreak="0">
+  <w:abstractNum w:abstractNumId="7" w15:restartNumberingAfterBreak="0">
     <w:nsid w:val="1C3005B4"/>
     <w:multiLevelType w:val="hybridMultilevel"/>
     <w:tmpl w:val="B6100304"/>
@@ -3520,7 +4490,547 @@
       </w:pPr>
     </w:lvl>
   </w:abstractNum>
-  <w:abstractNum w:abstractNumId="7" w15:restartNumberingAfterBreak="0">
+  <w:abstractNum w:abstractNumId="8" w15:restartNumberingAfterBreak="0">
+    <w:nsid w:val="21F02C8F"/>
+    <w:multiLevelType w:val="hybridMultilevel"/>
+    <w:tmpl w:val="D834E98C"/>
+    <w:lvl w:ilvl="0" w:tplc="DD185C7E">
+      <w:numFmt w:val="bullet"/>
+      <w:lvlText w:val="-"/>
+      <w:lvlJc w:val="left"/>
+      <w:pPr>
+        <w:ind w:left="720" w:hanging="360"/>
+      </w:pPr>
+      <w:rPr>
+        <w:rFonts w:ascii="Arial" w:eastAsiaTheme="minorHAnsi" w:hAnsi="Arial" w:cs="Arial" w:hint="default"/>
+      </w:rPr>
+    </w:lvl>
+    <w:lvl w:ilvl="1" w:tplc="04090003" w:tentative="1">
+      <w:start w:val="1"/>
+      <w:numFmt w:val="bullet"/>
+      <w:lvlText w:val="o"/>
+      <w:lvlJc w:val="left"/>
+      <w:pPr>
+        <w:ind w:left="1440" w:hanging="360"/>
+      </w:pPr>
+      <w:rPr>
+        <w:rFonts w:ascii="Courier New" w:hAnsi="Courier New" w:cs="Courier New" w:hint="default"/>
+      </w:rPr>
+    </w:lvl>
+    <w:lvl w:ilvl="2" w:tplc="04090005" w:tentative="1">
+      <w:start w:val="1"/>
+      <w:numFmt w:val="bullet"/>
+      <w:lvlText w:val=""/>
+      <w:lvlJc w:val="left"/>
+      <w:pPr>
+        <w:ind w:left="2160" w:hanging="360"/>
+      </w:pPr>
+      <w:rPr>
+        <w:rFonts w:ascii="Wingdings" w:hAnsi="Wingdings" w:hint="default"/>
+      </w:rPr>
+    </w:lvl>
+    <w:lvl w:ilvl="3" w:tplc="04090001" w:tentative="1">
+      <w:start w:val="1"/>
+      <w:numFmt w:val="bullet"/>
+      <w:lvlText w:val=""/>
+      <w:lvlJc w:val="left"/>
+      <w:pPr>
+        <w:ind w:left="2880" w:hanging="360"/>
+      </w:pPr>
+      <w:rPr>
+        <w:rFonts w:ascii="Symbol" w:hAnsi="Symbol" w:hint="default"/>
+      </w:rPr>
+    </w:lvl>
+    <w:lvl w:ilvl="4" w:tplc="04090003" w:tentative="1">
+      <w:start w:val="1"/>
+      <w:numFmt w:val="bullet"/>
+      <w:lvlText w:val="o"/>
+      <w:lvlJc w:val="left"/>
+      <w:pPr>
+        <w:ind w:left="3600" w:hanging="360"/>
+      </w:pPr>
+      <w:rPr>
+        <w:rFonts w:ascii="Courier New" w:hAnsi="Courier New" w:cs="Courier New" w:hint="default"/>
+      </w:rPr>
+    </w:lvl>
+    <w:lvl w:ilvl="5" w:tplc="04090005" w:tentative="1">
+      <w:start w:val="1"/>
+      <w:numFmt w:val="bullet"/>
+      <w:lvlText w:val=""/>
+      <w:lvlJc w:val="left"/>
+      <w:pPr>
+        <w:ind w:left="4320" w:hanging="360"/>
+      </w:pPr>
+      <w:rPr>
+        <w:rFonts w:ascii="Wingdings" w:hAnsi="Wingdings" w:hint="default"/>
+      </w:rPr>
+    </w:lvl>
+    <w:lvl w:ilvl="6" w:tplc="04090001" w:tentative="1">
+      <w:start w:val="1"/>
+      <w:numFmt w:val="bullet"/>
+      <w:lvlText w:val=""/>
+      <w:lvlJc w:val="left"/>
+      <w:pPr>
+        <w:ind w:left="5040" w:hanging="360"/>
+      </w:pPr>
+      <w:rPr>
+        <w:rFonts w:ascii="Symbol" w:hAnsi="Symbol" w:hint="default"/>
+      </w:rPr>
+    </w:lvl>
+    <w:lvl w:ilvl="7" w:tplc="04090003" w:tentative="1">
+      <w:start w:val="1"/>
+      <w:numFmt w:val="bullet"/>
+      <w:lvlText w:val="o"/>
+      <w:lvlJc w:val="left"/>
+      <w:pPr>
+        <w:ind w:left="5760" w:hanging="360"/>
+      </w:pPr>
+      <w:rPr>
+        <w:rFonts w:ascii="Courier New" w:hAnsi="Courier New" w:cs="Courier New" w:hint="default"/>
+      </w:rPr>
+    </w:lvl>
+    <w:lvl w:ilvl="8" w:tplc="04090005" w:tentative="1">
+      <w:start w:val="1"/>
+      <w:numFmt w:val="bullet"/>
+      <w:lvlText w:val=""/>
+      <w:lvlJc w:val="left"/>
+      <w:pPr>
+        <w:ind w:left="6480" w:hanging="360"/>
+      </w:pPr>
+      <w:rPr>
+        <w:rFonts w:ascii="Wingdings" w:hAnsi="Wingdings" w:hint="default"/>
+      </w:rPr>
+    </w:lvl>
+  </w:abstractNum>
+  <w:abstractNum w:abstractNumId="9" w15:restartNumberingAfterBreak="0">
+    <w:nsid w:val="233F582A"/>
+    <w:multiLevelType w:val="hybridMultilevel"/>
+    <w:tmpl w:val="21B43868"/>
+    <w:lvl w:ilvl="0" w:tplc="04090001">
+      <w:start w:val="1"/>
+      <w:numFmt w:val="bullet"/>
+      <w:lvlText w:val=""/>
+      <w:lvlJc w:val="left"/>
+      <w:pPr>
+        <w:ind w:left="1440" w:hanging="360"/>
+      </w:pPr>
+      <w:rPr>
+        <w:rFonts w:ascii="Symbol" w:hAnsi="Symbol" w:hint="default"/>
+      </w:rPr>
+    </w:lvl>
+    <w:lvl w:ilvl="1" w:tplc="04090003" w:tentative="1">
+      <w:start w:val="1"/>
+      <w:numFmt w:val="bullet"/>
+      <w:lvlText w:val="o"/>
+      <w:lvlJc w:val="left"/>
+      <w:pPr>
+        <w:ind w:left="2160" w:hanging="360"/>
+      </w:pPr>
+      <w:rPr>
+        <w:rFonts w:ascii="Courier New" w:hAnsi="Courier New" w:cs="Courier New" w:hint="default"/>
+      </w:rPr>
+    </w:lvl>
+    <w:lvl w:ilvl="2" w:tplc="04090005" w:tentative="1">
+      <w:start w:val="1"/>
+      <w:numFmt w:val="bullet"/>
+      <w:lvlText w:val=""/>
+      <w:lvlJc w:val="left"/>
+      <w:pPr>
+        <w:ind w:left="2880" w:hanging="360"/>
+      </w:pPr>
+      <w:rPr>
+        <w:rFonts w:ascii="Wingdings" w:hAnsi="Wingdings" w:hint="default"/>
+      </w:rPr>
+    </w:lvl>
+    <w:lvl w:ilvl="3" w:tplc="04090001" w:tentative="1">
+      <w:start w:val="1"/>
+      <w:numFmt w:val="bullet"/>
+      <w:lvlText w:val=""/>
+      <w:lvlJc w:val="left"/>
+      <w:pPr>
+        <w:ind w:left="3600" w:hanging="360"/>
+      </w:pPr>
+      <w:rPr>
+        <w:rFonts w:ascii="Symbol" w:hAnsi="Symbol" w:hint="default"/>
+      </w:rPr>
+    </w:lvl>
+    <w:lvl w:ilvl="4" w:tplc="04090003" w:tentative="1">
+      <w:start w:val="1"/>
+      <w:numFmt w:val="bullet"/>
+      <w:lvlText w:val="o"/>
+      <w:lvlJc w:val="left"/>
+      <w:pPr>
+        <w:ind w:left="4320" w:hanging="360"/>
+      </w:pPr>
+      <w:rPr>
+        <w:rFonts w:ascii="Courier New" w:hAnsi="Courier New" w:cs="Courier New" w:hint="default"/>
+      </w:rPr>
+    </w:lvl>
+    <w:lvl w:ilvl="5" w:tplc="04090005" w:tentative="1">
+      <w:start w:val="1"/>
+      <w:numFmt w:val="bullet"/>
+      <w:lvlText w:val=""/>
+      <w:lvlJc w:val="left"/>
+      <w:pPr>
+        <w:ind w:left="5040" w:hanging="360"/>
+      </w:pPr>
+      <w:rPr>
+        <w:rFonts w:ascii="Wingdings" w:hAnsi="Wingdings" w:hint="default"/>
+      </w:rPr>
+    </w:lvl>
+    <w:lvl w:ilvl="6" w:tplc="04090001" w:tentative="1">
+      <w:start w:val="1"/>
+      <w:numFmt w:val="bullet"/>
+      <w:lvlText w:val=""/>
+      <w:lvlJc w:val="left"/>
+      <w:pPr>
+        <w:ind w:left="5760" w:hanging="360"/>
+      </w:pPr>
+      <w:rPr>
+        <w:rFonts w:ascii="Symbol" w:hAnsi="Symbol" w:hint="default"/>
+      </w:rPr>
+    </w:lvl>
+    <w:lvl w:ilvl="7" w:tplc="04090003" w:tentative="1">
+      <w:start w:val="1"/>
+      <w:numFmt w:val="bullet"/>
+      <w:lvlText w:val="o"/>
+      <w:lvlJc w:val="left"/>
+      <w:pPr>
+        <w:ind w:left="6480" w:hanging="360"/>
+      </w:pPr>
+      <w:rPr>
+        <w:rFonts w:ascii="Courier New" w:hAnsi="Courier New" w:cs="Courier New" w:hint="default"/>
+      </w:rPr>
+    </w:lvl>
+    <w:lvl w:ilvl="8" w:tplc="04090005" w:tentative="1">
+      <w:start w:val="1"/>
+      <w:numFmt w:val="bullet"/>
+      <w:lvlText w:val=""/>
+      <w:lvlJc w:val="left"/>
+      <w:pPr>
+        <w:ind w:left="7200" w:hanging="360"/>
+      </w:pPr>
+      <w:rPr>
+        <w:rFonts w:ascii="Wingdings" w:hAnsi="Wingdings" w:hint="default"/>
+      </w:rPr>
+    </w:lvl>
+  </w:abstractNum>
+  <w:abstractNum w:abstractNumId="10" w15:restartNumberingAfterBreak="0">
+    <w:nsid w:val="25513BE9"/>
+    <w:multiLevelType w:val="hybridMultilevel"/>
+    <w:tmpl w:val="6D385944"/>
+    <w:lvl w:ilvl="0" w:tplc="AB52EC14">
+      <w:start w:val="1"/>
+      <w:numFmt w:val="decimal"/>
+      <w:lvlText w:val="%1-"/>
+      <w:lvlJc w:val="left"/>
+      <w:pPr>
+        <w:ind w:left="720" w:hanging="360"/>
+      </w:pPr>
+      <w:rPr>
+        <w:rFonts w:hint="default"/>
+      </w:rPr>
+    </w:lvl>
+    <w:lvl w:ilvl="1" w:tplc="04090019" w:tentative="1">
+      <w:start w:val="1"/>
+      <w:numFmt w:val="lowerLetter"/>
+      <w:lvlText w:val="%2."/>
+      <w:lvlJc w:val="left"/>
+      <w:pPr>
+        <w:ind w:left="1440" w:hanging="360"/>
+      </w:pPr>
+    </w:lvl>
+    <w:lvl w:ilvl="2" w:tplc="0409001B" w:tentative="1">
+      <w:start w:val="1"/>
+      <w:numFmt w:val="lowerRoman"/>
+      <w:lvlText w:val="%3."/>
+      <w:lvlJc w:val="right"/>
+      <w:pPr>
+        <w:ind w:left="2160" w:hanging="180"/>
+      </w:pPr>
+    </w:lvl>
+    <w:lvl w:ilvl="3" w:tplc="0409000F" w:tentative="1">
+      <w:start w:val="1"/>
+      <w:numFmt w:val="decimal"/>
+      <w:lvlText w:val="%4."/>
+      <w:lvlJc w:val="left"/>
+      <w:pPr>
+        <w:ind w:left="2880" w:hanging="360"/>
+      </w:pPr>
+    </w:lvl>
+    <w:lvl w:ilvl="4" w:tplc="04090019" w:tentative="1">
+      <w:start w:val="1"/>
+      <w:numFmt w:val="lowerLetter"/>
+      <w:lvlText w:val="%5."/>
+      <w:lvlJc w:val="left"/>
+      <w:pPr>
+        <w:ind w:left="3600" w:hanging="360"/>
+      </w:pPr>
+    </w:lvl>
+    <w:lvl w:ilvl="5" w:tplc="0409001B" w:tentative="1">
+      <w:start w:val="1"/>
+      <w:numFmt w:val="lowerRoman"/>
+      <w:lvlText w:val="%6."/>
+      <w:lvlJc w:val="right"/>
+      <w:pPr>
+        <w:ind w:left="4320" w:hanging="180"/>
+      </w:pPr>
+    </w:lvl>
+    <w:lvl w:ilvl="6" w:tplc="0409000F" w:tentative="1">
+      <w:start w:val="1"/>
+      <w:numFmt w:val="decimal"/>
+      <w:lvlText w:val="%7."/>
+      <w:lvlJc w:val="left"/>
+      <w:pPr>
+        <w:ind w:left="5040" w:hanging="360"/>
+      </w:pPr>
+    </w:lvl>
+    <w:lvl w:ilvl="7" w:tplc="04090019" w:tentative="1">
+      <w:start w:val="1"/>
+      <w:numFmt w:val="lowerLetter"/>
+      <w:lvlText w:val="%8."/>
+      <w:lvlJc w:val="left"/>
+      <w:pPr>
+        <w:ind w:left="5760" w:hanging="360"/>
+      </w:pPr>
+    </w:lvl>
+    <w:lvl w:ilvl="8" w:tplc="0409001B" w:tentative="1">
+      <w:start w:val="1"/>
+      <w:numFmt w:val="lowerRoman"/>
+      <w:lvlText w:val="%9."/>
+      <w:lvlJc w:val="right"/>
+      <w:pPr>
+        <w:ind w:left="6480" w:hanging="180"/>
+      </w:pPr>
+    </w:lvl>
+  </w:abstractNum>
+  <w:abstractNum w:abstractNumId="11" w15:restartNumberingAfterBreak="0">
+    <w:nsid w:val="27C67EC2"/>
+    <w:multiLevelType w:val="hybridMultilevel"/>
+    <w:tmpl w:val="5A861C34"/>
+    <w:lvl w:ilvl="0" w:tplc="04090001">
+      <w:start w:val="1"/>
+      <w:numFmt w:val="bullet"/>
+      <w:lvlText w:val=""/>
+      <w:lvlJc w:val="left"/>
+      <w:pPr>
+        <w:ind w:left="1440" w:hanging="360"/>
+      </w:pPr>
+      <w:rPr>
+        <w:rFonts w:ascii="Symbol" w:hAnsi="Symbol" w:hint="default"/>
+      </w:rPr>
+    </w:lvl>
+    <w:lvl w:ilvl="1" w:tplc="04090003" w:tentative="1">
+      <w:start w:val="1"/>
+      <w:numFmt w:val="bullet"/>
+      <w:lvlText w:val="o"/>
+      <w:lvlJc w:val="left"/>
+      <w:pPr>
+        <w:ind w:left="2160" w:hanging="360"/>
+      </w:pPr>
+      <w:rPr>
+        <w:rFonts w:ascii="Courier New" w:hAnsi="Courier New" w:cs="Courier New" w:hint="default"/>
+      </w:rPr>
+    </w:lvl>
+    <w:lvl w:ilvl="2" w:tplc="04090005" w:tentative="1">
+      <w:start w:val="1"/>
+      <w:numFmt w:val="bullet"/>
+      <w:lvlText w:val=""/>
+      <w:lvlJc w:val="left"/>
+      <w:pPr>
+        <w:ind w:left="2880" w:hanging="360"/>
+      </w:pPr>
+      <w:rPr>
+        <w:rFonts w:ascii="Wingdings" w:hAnsi="Wingdings" w:hint="default"/>
+      </w:rPr>
+    </w:lvl>
+    <w:lvl w:ilvl="3" w:tplc="04090001" w:tentative="1">
+      <w:start w:val="1"/>
+      <w:numFmt w:val="bullet"/>
+      <w:lvlText w:val=""/>
+      <w:lvlJc w:val="left"/>
+      <w:pPr>
+        <w:ind w:left="3600" w:hanging="360"/>
+      </w:pPr>
+      <w:rPr>
+        <w:rFonts w:ascii="Symbol" w:hAnsi="Symbol" w:hint="default"/>
+      </w:rPr>
+    </w:lvl>
+    <w:lvl w:ilvl="4" w:tplc="04090003" w:tentative="1">
+      <w:start w:val="1"/>
+      <w:numFmt w:val="bullet"/>
+      <w:lvlText w:val="o"/>
+      <w:lvlJc w:val="left"/>
+      <w:pPr>
+        <w:ind w:left="4320" w:hanging="360"/>
+      </w:pPr>
+      <w:rPr>
+        <w:rFonts w:ascii="Courier New" w:hAnsi="Courier New" w:cs="Courier New" w:hint="default"/>
+      </w:rPr>
+    </w:lvl>
+    <w:lvl w:ilvl="5" w:tplc="04090005" w:tentative="1">
+      <w:start w:val="1"/>
+      <w:numFmt w:val="bullet"/>
+      <w:lvlText w:val=""/>
+      <w:lvlJc w:val="left"/>
+      <w:pPr>
+        <w:ind w:left="5040" w:hanging="360"/>
+      </w:pPr>
+      <w:rPr>
+        <w:rFonts w:ascii="Wingdings" w:hAnsi="Wingdings" w:hint="default"/>
+      </w:rPr>
+    </w:lvl>
+    <w:lvl w:ilvl="6" w:tplc="04090001" w:tentative="1">
+      <w:start w:val="1"/>
+      <w:numFmt w:val="bullet"/>
+      <w:lvlText w:val=""/>
+      <w:lvlJc w:val="left"/>
+      <w:pPr>
+        <w:ind w:left="5760" w:hanging="360"/>
+      </w:pPr>
+      <w:rPr>
+        <w:rFonts w:ascii="Symbol" w:hAnsi="Symbol" w:hint="default"/>
+      </w:rPr>
+    </w:lvl>
+    <w:lvl w:ilvl="7" w:tplc="04090003" w:tentative="1">
+      <w:start w:val="1"/>
+      <w:numFmt w:val="bullet"/>
+      <w:lvlText w:val="o"/>
+      <w:lvlJc w:val="left"/>
+      <w:pPr>
+        <w:ind w:left="6480" w:hanging="360"/>
+      </w:pPr>
+      <w:rPr>
+        <w:rFonts w:ascii="Courier New" w:hAnsi="Courier New" w:cs="Courier New" w:hint="default"/>
+      </w:rPr>
+    </w:lvl>
+    <w:lvl w:ilvl="8" w:tplc="04090005" w:tentative="1">
+      <w:start w:val="1"/>
+      <w:numFmt w:val="bullet"/>
+      <w:lvlText w:val=""/>
+      <w:lvlJc w:val="left"/>
+      <w:pPr>
+        <w:ind w:left="7200" w:hanging="360"/>
+      </w:pPr>
+      <w:rPr>
+        <w:rFonts w:ascii="Wingdings" w:hAnsi="Wingdings" w:hint="default"/>
+      </w:rPr>
+    </w:lvl>
+  </w:abstractNum>
+  <w:abstractNum w:abstractNumId="12" w15:restartNumberingAfterBreak="0">
+    <w:nsid w:val="29251BB3"/>
+    <w:multiLevelType w:val="hybridMultilevel"/>
+    <w:tmpl w:val="9260F2A2"/>
+    <w:lvl w:ilvl="0" w:tplc="04090001">
+      <w:start w:val="1"/>
+      <w:numFmt w:val="bullet"/>
+      <w:lvlText w:val=""/>
+      <w:lvlJc w:val="left"/>
+      <w:pPr>
+        <w:ind w:left="1440" w:hanging="360"/>
+      </w:pPr>
+      <w:rPr>
+        <w:rFonts w:ascii="Symbol" w:hAnsi="Symbol" w:hint="default"/>
+      </w:rPr>
+    </w:lvl>
+    <w:lvl w:ilvl="1" w:tplc="04090003" w:tentative="1">
+      <w:start w:val="1"/>
+      <w:numFmt w:val="bullet"/>
+      <w:lvlText w:val="o"/>
+      <w:lvlJc w:val="left"/>
+      <w:pPr>
+        <w:ind w:left="2160" w:hanging="360"/>
+      </w:pPr>
+      <w:rPr>
+        <w:rFonts w:ascii="Courier New" w:hAnsi="Courier New" w:cs="Courier New" w:hint="default"/>
+      </w:rPr>
+    </w:lvl>
+    <w:lvl w:ilvl="2" w:tplc="04090005" w:tentative="1">
+      <w:start w:val="1"/>
+      <w:numFmt w:val="bullet"/>
+      <w:lvlText w:val=""/>
+      <w:lvlJc w:val="left"/>
+      <w:pPr>
+        <w:ind w:left="2880" w:hanging="360"/>
+      </w:pPr>
+      <w:rPr>
+        <w:rFonts w:ascii="Wingdings" w:hAnsi="Wingdings" w:hint="default"/>
+      </w:rPr>
+    </w:lvl>
+    <w:lvl w:ilvl="3" w:tplc="04090001" w:tentative="1">
+      <w:start w:val="1"/>
+      <w:numFmt w:val="bullet"/>
+      <w:lvlText w:val=""/>
+      <w:lvlJc w:val="left"/>
+      <w:pPr>
+        <w:ind w:left="3600" w:hanging="360"/>
+      </w:pPr>
+      <w:rPr>
+        <w:rFonts w:ascii="Symbol" w:hAnsi="Symbol" w:hint="default"/>
+      </w:rPr>
+    </w:lvl>
+    <w:lvl w:ilvl="4" w:tplc="04090003" w:tentative="1">
+      <w:start w:val="1"/>
+      <w:numFmt w:val="bullet"/>
+      <w:lvlText w:val="o"/>
+      <w:lvlJc w:val="left"/>
+      <w:pPr>
+        <w:ind w:left="4320" w:hanging="360"/>
+      </w:pPr>
+      <w:rPr>
+        <w:rFonts w:ascii="Courier New" w:hAnsi="Courier New" w:cs="Courier New" w:hint="default"/>
+      </w:rPr>
+    </w:lvl>
+    <w:lvl w:ilvl="5" w:tplc="04090005" w:tentative="1">
+      <w:start w:val="1"/>
+      <w:numFmt w:val="bullet"/>
+      <w:lvlText w:val=""/>
+      <w:lvlJc w:val="left"/>
+      <w:pPr>
+        <w:ind w:left="5040" w:hanging="360"/>
+      </w:pPr>
+      <w:rPr>
+        <w:rFonts w:ascii="Wingdings" w:hAnsi="Wingdings" w:hint="default"/>
+      </w:rPr>
+    </w:lvl>
+    <w:lvl w:ilvl="6" w:tplc="04090001" w:tentative="1">
+      <w:start w:val="1"/>
+      <w:numFmt w:val="bullet"/>
+      <w:lvlText w:val=""/>
+      <w:lvlJc w:val="left"/>
+      <w:pPr>
+        <w:ind w:left="5760" w:hanging="360"/>
+      </w:pPr>
+      <w:rPr>
+        <w:rFonts w:ascii="Symbol" w:hAnsi="Symbol" w:hint="default"/>
+      </w:rPr>
+    </w:lvl>
+    <w:lvl w:ilvl="7" w:tplc="04090003" w:tentative="1">
+      <w:start w:val="1"/>
+      <w:numFmt w:val="bullet"/>
+      <w:lvlText w:val="o"/>
+      <w:lvlJc w:val="left"/>
+      <w:pPr>
+        <w:ind w:left="6480" w:hanging="360"/>
+      </w:pPr>
+      <w:rPr>
+        <w:rFonts w:ascii="Courier New" w:hAnsi="Courier New" w:cs="Courier New" w:hint="default"/>
+      </w:rPr>
+    </w:lvl>
+    <w:lvl w:ilvl="8" w:tplc="04090005" w:tentative="1">
+      <w:start w:val="1"/>
+      <w:numFmt w:val="bullet"/>
+      <w:lvlText w:val=""/>
+      <w:lvlJc w:val="left"/>
+      <w:pPr>
+        <w:ind w:left="7200" w:hanging="360"/>
+      </w:pPr>
+      <w:rPr>
+        <w:rFonts w:ascii="Wingdings" w:hAnsi="Wingdings" w:hint="default"/>
+      </w:rPr>
+    </w:lvl>
+  </w:abstractNum>
+  <w:abstractNum w:abstractNumId="13" w15:restartNumberingAfterBreak="0">
     <w:nsid w:val="3870524D"/>
     <w:multiLevelType w:val="hybridMultilevel"/>
     <w:tmpl w:val="1C5C6DA8"/>
@@ -3633,10 +5143,10 @@
       </w:rPr>
     </w:lvl>
   </w:abstractNum>
-  <w:abstractNum w:abstractNumId="8" w15:restartNumberingAfterBreak="0">
+  <w:abstractNum w:abstractNumId="14" w15:restartNumberingAfterBreak="0">
     <w:nsid w:val="3FDE591C"/>
     <w:multiLevelType w:val="hybridMultilevel"/>
-    <w:tmpl w:val="99D4E8DE"/>
+    <w:tmpl w:val="4C1E932C"/>
     <w:lvl w:ilvl="0" w:tplc="04090001">
       <w:start w:val="1"/>
       <w:numFmt w:val="bullet"/>
@@ -3746,7 +5256,7 @@
       </w:rPr>
     </w:lvl>
   </w:abstractNum>
-  <w:abstractNum w:abstractNumId="9" w15:restartNumberingAfterBreak="0">
+  <w:abstractNum w:abstractNumId="15" w15:restartNumberingAfterBreak="0">
     <w:nsid w:val="42697714"/>
     <w:multiLevelType w:val="hybridMultilevel"/>
     <w:tmpl w:val="416C4EFC"/>
@@ -3858,7 +5368,7 @@
       </w:rPr>
     </w:lvl>
   </w:abstractNum>
-  <w:abstractNum w:abstractNumId="10" w15:restartNumberingAfterBreak="0">
+  <w:abstractNum w:abstractNumId="16" w15:restartNumberingAfterBreak="0">
     <w:nsid w:val="45422D0B"/>
     <w:multiLevelType w:val="hybridMultilevel"/>
     <w:tmpl w:val="936061E0"/>
@@ -3971,7 +5481,96 @@
       </w:rPr>
     </w:lvl>
   </w:abstractNum>
-  <w:abstractNum w:abstractNumId="11" w15:restartNumberingAfterBreak="0">
+  <w:abstractNum w:abstractNumId="17" w15:restartNumberingAfterBreak="0">
+    <w:nsid w:val="477C2B82"/>
+    <w:multiLevelType w:val="hybridMultilevel"/>
+    <w:tmpl w:val="2F84440C"/>
+    <w:lvl w:ilvl="0" w:tplc="10C84FDC">
+      <w:start w:val="1"/>
+      <w:numFmt w:val="decimal"/>
+      <w:lvlText w:val="%1-"/>
+      <w:lvlJc w:val="left"/>
+      <w:pPr>
+        <w:ind w:left="720" w:hanging="360"/>
+      </w:pPr>
+      <w:rPr>
+        <w:rFonts w:hint="default"/>
+      </w:rPr>
+    </w:lvl>
+    <w:lvl w:ilvl="1" w:tplc="04090019" w:tentative="1">
+      <w:start w:val="1"/>
+      <w:numFmt w:val="lowerLetter"/>
+      <w:lvlText w:val="%2."/>
+      <w:lvlJc w:val="left"/>
+      <w:pPr>
+        <w:ind w:left="1440" w:hanging="360"/>
+      </w:pPr>
+    </w:lvl>
+    <w:lvl w:ilvl="2" w:tplc="0409001B" w:tentative="1">
+      <w:start w:val="1"/>
+      <w:numFmt w:val="lowerRoman"/>
+      <w:lvlText w:val="%3."/>
+      <w:lvlJc w:val="right"/>
+      <w:pPr>
+        <w:ind w:left="2160" w:hanging="180"/>
+      </w:pPr>
+    </w:lvl>
+    <w:lvl w:ilvl="3" w:tplc="0409000F" w:tentative="1">
+      <w:start w:val="1"/>
+      <w:numFmt w:val="decimal"/>
+      <w:lvlText w:val="%4."/>
+      <w:lvlJc w:val="left"/>
+      <w:pPr>
+        <w:ind w:left="2880" w:hanging="360"/>
+      </w:pPr>
+    </w:lvl>
+    <w:lvl w:ilvl="4" w:tplc="04090019" w:tentative="1">
+      <w:start w:val="1"/>
+      <w:numFmt w:val="lowerLetter"/>
+      <w:lvlText w:val="%5."/>
+      <w:lvlJc w:val="left"/>
+      <w:pPr>
+        <w:ind w:left="3600" w:hanging="360"/>
+      </w:pPr>
+    </w:lvl>
+    <w:lvl w:ilvl="5" w:tplc="0409001B" w:tentative="1">
+      <w:start w:val="1"/>
+      <w:numFmt w:val="lowerRoman"/>
+      <w:lvlText w:val="%6."/>
+      <w:lvlJc w:val="right"/>
+      <w:pPr>
+        <w:ind w:left="4320" w:hanging="180"/>
+      </w:pPr>
+    </w:lvl>
+    <w:lvl w:ilvl="6" w:tplc="0409000F" w:tentative="1">
+      <w:start w:val="1"/>
+      <w:numFmt w:val="decimal"/>
+      <w:lvlText w:val="%7."/>
+      <w:lvlJc w:val="left"/>
+      <w:pPr>
+        <w:ind w:left="5040" w:hanging="360"/>
+      </w:pPr>
+    </w:lvl>
+    <w:lvl w:ilvl="7" w:tplc="04090019" w:tentative="1">
+      <w:start w:val="1"/>
+      <w:numFmt w:val="lowerLetter"/>
+      <w:lvlText w:val="%8."/>
+      <w:lvlJc w:val="left"/>
+      <w:pPr>
+        <w:ind w:left="5760" w:hanging="360"/>
+      </w:pPr>
+    </w:lvl>
+    <w:lvl w:ilvl="8" w:tplc="0409001B" w:tentative="1">
+      <w:start w:val="1"/>
+      <w:numFmt w:val="lowerRoman"/>
+      <w:lvlText w:val="%9."/>
+      <w:lvlJc w:val="right"/>
+      <w:pPr>
+        <w:ind w:left="6480" w:hanging="180"/>
+      </w:pPr>
+    </w:lvl>
+  </w:abstractNum>
+  <w:abstractNum w:abstractNumId="18" w15:restartNumberingAfterBreak="0">
     <w:nsid w:val="521953EA"/>
     <w:multiLevelType w:val="hybridMultilevel"/>
     <w:tmpl w:val="2BF81D0C"/>
@@ -4060,7 +5659,7 @@
       </w:pPr>
     </w:lvl>
   </w:abstractNum>
-  <w:abstractNum w:abstractNumId="12" w15:restartNumberingAfterBreak="0">
+  <w:abstractNum w:abstractNumId="19" w15:restartNumberingAfterBreak="0">
     <w:nsid w:val="543F2F20"/>
     <w:multiLevelType w:val="hybridMultilevel"/>
     <w:tmpl w:val="3A1C8D98"/>
@@ -4149,7 +5748,7 @@
       </w:pPr>
     </w:lvl>
   </w:abstractNum>
-  <w:abstractNum w:abstractNumId="13" w15:restartNumberingAfterBreak="0">
+  <w:abstractNum w:abstractNumId="20" w15:restartNumberingAfterBreak="0">
     <w:nsid w:val="54B27CD8"/>
     <w:multiLevelType w:val="hybridMultilevel"/>
     <w:tmpl w:val="CBF4E324"/>
@@ -4238,7 +5837,96 @@
       </w:pPr>
     </w:lvl>
   </w:abstractNum>
-  <w:abstractNum w:abstractNumId="14" w15:restartNumberingAfterBreak="0">
+  <w:abstractNum w:abstractNumId="21" w15:restartNumberingAfterBreak="0">
+    <w:nsid w:val="57B63434"/>
+    <w:multiLevelType w:val="hybridMultilevel"/>
+    <w:tmpl w:val="5A84D01E"/>
+    <w:lvl w:ilvl="0" w:tplc="F5DA4578">
+      <w:start w:val="1"/>
+      <w:numFmt w:val="decimal"/>
+      <w:lvlText w:val="%1-"/>
+      <w:lvlJc w:val="left"/>
+      <w:pPr>
+        <w:ind w:left="1080" w:hanging="360"/>
+      </w:pPr>
+      <w:rPr>
+        <w:rFonts w:hint="default"/>
+      </w:rPr>
+    </w:lvl>
+    <w:lvl w:ilvl="1" w:tplc="04090019" w:tentative="1">
+      <w:start w:val="1"/>
+      <w:numFmt w:val="lowerLetter"/>
+      <w:lvlText w:val="%2."/>
+      <w:lvlJc w:val="left"/>
+      <w:pPr>
+        <w:ind w:left="1800" w:hanging="360"/>
+      </w:pPr>
+    </w:lvl>
+    <w:lvl w:ilvl="2" w:tplc="0409001B" w:tentative="1">
+      <w:start w:val="1"/>
+      <w:numFmt w:val="lowerRoman"/>
+      <w:lvlText w:val="%3."/>
+      <w:lvlJc w:val="right"/>
+      <w:pPr>
+        <w:ind w:left="2520" w:hanging="180"/>
+      </w:pPr>
+    </w:lvl>
+    <w:lvl w:ilvl="3" w:tplc="0409000F" w:tentative="1">
+      <w:start w:val="1"/>
+      <w:numFmt w:val="decimal"/>
+      <w:lvlText w:val="%4."/>
+      <w:lvlJc w:val="left"/>
+      <w:pPr>
+        <w:ind w:left="3240" w:hanging="360"/>
+      </w:pPr>
+    </w:lvl>
+    <w:lvl w:ilvl="4" w:tplc="04090019" w:tentative="1">
+      <w:start w:val="1"/>
+      <w:numFmt w:val="lowerLetter"/>
+      <w:lvlText w:val="%5."/>
+      <w:lvlJc w:val="left"/>
+      <w:pPr>
+        <w:ind w:left="3960" w:hanging="360"/>
+      </w:pPr>
+    </w:lvl>
+    <w:lvl w:ilvl="5" w:tplc="0409001B" w:tentative="1">
+      <w:start w:val="1"/>
+      <w:numFmt w:val="lowerRoman"/>
+      <w:lvlText w:val="%6."/>
+      <w:lvlJc w:val="right"/>
+      <w:pPr>
+        <w:ind w:left="4680" w:hanging="180"/>
+      </w:pPr>
+    </w:lvl>
+    <w:lvl w:ilvl="6" w:tplc="0409000F" w:tentative="1">
+      <w:start w:val="1"/>
+      <w:numFmt w:val="decimal"/>
+      <w:lvlText w:val="%7."/>
+      <w:lvlJc w:val="left"/>
+      <w:pPr>
+        <w:ind w:left="5400" w:hanging="360"/>
+      </w:pPr>
+    </w:lvl>
+    <w:lvl w:ilvl="7" w:tplc="04090019" w:tentative="1">
+      <w:start w:val="1"/>
+      <w:numFmt w:val="lowerLetter"/>
+      <w:lvlText w:val="%8."/>
+      <w:lvlJc w:val="left"/>
+      <w:pPr>
+        <w:ind w:left="6120" w:hanging="360"/>
+      </w:pPr>
+    </w:lvl>
+    <w:lvl w:ilvl="8" w:tplc="0409001B" w:tentative="1">
+      <w:start w:val="1"/>
+      <w:numFmt w:val="lowerRoman"/>
+      <w:lvlText w:val="%9."/>
+      <w:lvlJc w:val="right"/>
+      <w:pPr>
+        <w:ind w:left="6840" w:hanging="180"/>
+      </w:pPr>
+    </w:lvl>
+  </w:abstractNum>
+  <w:abstractNum w:abstractNumId="22" w15:restartNumberingAfterBreak="0">
     <w:nsid w:val="5D136922"/>
     <w:multiLevelType w:val="hybridMultilevel"/>
     <w:tmpl w:val="47560A7C"/>
@@ -4327,7 +6015,7 @@
       </w:pPr>
     </w:lvl>
   </w:abstractNum>
-  <w:abstractNum w:abstractNumId="15" w15:restartNumberingAfterBreak="0">
+  <w:abstractNum w:abstractNumId="23" w15:restartNumberingAfterBreak="0">
     <w:nsid w:val="5FCD087D"/>
     <w:multiLevelType w:val="hybridMultilevel"/>
     <w:tmpl w:val="291A1D16"/>
@@ -4416,7 +6104,7 @@
       </w:pPr>
     </w:lvl>
   </w:abstractNum>
-  <w:abstractNum w:abstractNumId="16" w15:restartNumberingAfterBreak="0">
+  <w:abstractNum w:abstractNumId="24" w15:restartNumberingAfterBreak="0">
     <w:nsid w:val="646074A8"/>
     <w:multiLevelType w:val="hybridMultilevel"/>
     <w:tmpl w:val="FE661C18"/>
@@ -4505,7 +6193,7 @@
       </w:pPr>
     </w:lvl>
   </w:abstractNum>
-  <w:abstractNum w:abstractNumId="17" w15:restartNumberingAfterBreak="0">
+  <w:abstractNum w:abstractNumId="25" w15:restartNumberingAfterBreak="0">
     <w:nsid w:val="6938511D"/>
     <w:multiLevelType w:val="hybridMultilevel"/>
     <w:tmpl w:val="AD2CE406"/>
@@ -4619,57 +6307,81 @@
     </w:lvl>
   </w:abstractNum>
   <w:num w:numId="1" w16cid:durableId="860388337">
-    <w:abstractNumId w:val="9"/>
+    <w:abstractNumId w:val="15"/>
   </w:num>
   <w:num w:numId="2" w16cid:durableId="108206727">
-    <w:abstractNumId w:val="6"/>
+    <w:abstractNumId w:val="7"/>
   </w:num>
   <w:num w:numId="3" w16cid:durableId="217593393">
-    <w:abstractNumId w:val="2"/>
+    <w:abstractNumId w:val="3"/>
   </w:num>
   <w:num w:numId="4" w16cid:durableId="1057437556">
-    <w:abstractNumId w:val="3"/>
+    <w:abstractNumId w:val="4"/>
   </w:num>
   <w:num w:numId="5" w16cid:durableId="65954799">
     <w:abstractNumId w:val="0"/>
   </w:num>
   <w:num w:numId="6" w16cid:durableId="661082042">
+    <w:abstractNumId w:val="25"/>
+  </w:num>
+  <w:num w:numId="7" w16cid:durableId="1498109789">
+    <w:abstractNumId w:val="23"/>
+  </w:num>
+  <w:num w:numId="8" w16cid:durableId="1704671704">
+    <w:abstractNumId w:val="20"/>
+  </w:num>
+  <w:num w:numId="9" w16cid:durableId="1517188479">
+    <w:abstractNumId w:val="24"/>
+  </w:num>
+  <w:num w:numId="10" w16cid:durableId="2084797449">
+    <w:abstractNumId w:val="14"/>
+  </w:num>
+  <w:num w:numId="11" w16cid:durableId="1390571505">
+    <w:abstractNumId w:val="16"/>
+  </w:num>
+  <w:num w:numId="12" w16cid:durableId="1766264816">
+    <w:abstractNumId w:val="6"/>
+  </w:num>
+  <w:num w:numId="13" w16cid:durableId="587538144">
+    <w:abstractNumId w:val="13"/>
+  </w:num>
+  <w:num w:numId="14" w16cid:durableId="1450320561">
+    <w:abstractNumId w:val="5"/>
+  </w:num>
+  <w:num w:numId="15" w16cid:durableId="893658992">
+    <w:abstractNumId w:val="2"/>
+  </w:num>
+  <w:num w:numId="16" w16cid:durableId="2118593800">
+    <w:abstractNumId w:val="18"/>
+  </w:num>
+  <w:num w:numId="17" w16cid:durableId="574122587">
+    <w:abstractNumId w:val="22"/>
+  </w:num>
+  <w:num w:numId="18" w16cid:durableId="2144038519">
+    <w:abstractNumId w:val="19"/>
+  </w:num>
+  <w:num w:numId="19" w16cid:durableId="928122475">
+    <w:abstractNumId w:val="8"/>
+  </w:num>
+  <w:num w:numId="20" w16cid:durableId="1963995403">
+    <w:abstractNumId w:val="1"/>
+  </w:num>
+  <w:num w:numId="21" w16cid:durableId="1141196936">
+    <w:abstractNumId w:val="10"/>
+  </w:num>
+  <w:num w:numId="22" w16cid:durableId="957224917">
+    <w:abstractNumId w:val="21"/>
+  </w:num>
+  <w:num w:numId="23" w16cid:durableId="1488785308">
     <w:abstractNumId w:val="17"/>
   </w:num>
-  <w:num w:numId="7" w16cid:durableId="1498109789">
-    <w:abstractNumId w:val="15"/>
+  <w:num w:numId="24" w16cid:durableId="803544353">
+    <w:abstractNumId w:val="9"/>
   </w:num>
-  <w:num w:numId="8" w16cid:durableId="1704671704">
-    <w:abstractNumId w:val="13"/>
-  </w:num>
-  <w:num w:numId="9" w16cid:durableId="1517188479">
-    <w:abstractNumId w:val="16"/>
-  </w:num>
-  <w:num w:numId="10" w16cid:durableId="2084797449">
-    <w:abstractNumId w:val="8"/>
-  </w:num>
-  <w:num w:numId="11" w16cid:durableId="1390571505">
-    <w:abstractNumId w:val="10"/>
-  </w:num>
-  <w:num w:numId="12" w16cid:durableId="1766264816">
-    <w:abstractNumId w:val="5"/>
-  </w:num>
-  <w:num w:numId="13" w16cid:durableId="587538144">
-    <w:abstractNumId w:val="7"/>
-  </w:num>
-  <w:num w:numId="14" w16cid:durableId="1450320561">
-    <w:abstractNumId w:val="4"/>
-  </w:num>
-  <w:num w:numId="15" w16cid:durableId="893658992">
-    <w:abstractNumId w:val="1"/>
-  </w:num>
-  <w:num w:numId="16" w16cid:durableId="2118593800">
+  <w:num w:numId="25" w16cid:durableId="1547133919">
     <w:abstractNumId w:val="11"/>
   </w:num>
-  <w:num w:numId="17" w16cid:durableId="574122587">
-    <w:abstractNumId w:val="14"/>
-  </w:num>
-  <w:num w:numId="18" w16cid:durableId="2144038519">
+  <w:num w:numId="26" w16cid:durableId="981033494">
     <w:abstractNumId w:val="12"/>
   </w:num>
 </w:numbering>
@@ -5279,6 +6991,7 @@
   <w:style w:type="character" w:default="1" w:styleId="a0">
     <w:name w:val="Default Paragraph Font"/>
     <w:uiPriority w:val="1"/>
+    <w:semiHidden/>
     <w:unhideWhenUsed/>
   </w:style>
   <w:style w:type="table" w:default="1" w:styleId="a1">

</xml_diff>